<commit_message>
Added cfront and modified s3 file
</commit_message>
<xml_diff>
--- a/S3 Tasks.docx
+++ b/S3 Tasks.docx
@@ -1800,7 +1800,33 @@
           <w:lang w:eastAsia="en-IN" w:bidi="ta-IN"/>
           <w14:ligatures w14:val="none"/>
         </w:rPr>
-        <w:t>Configure a bucket policy so only the Admin user can see the objects of the S3 bucket.</w:t>
+        <w:t xml:space="preserve">Configure a bucket policy so only the </w:t>
+      </w:r>
+      <w:proofErr w:type="gramStart"/>
+      <w:r>
+        <w:rPr>
+          <w:rFonts w:eastAsia="Times New Roman" w:cstheme="minorHAnsi"/>
+          <w:color w:val="1D1C1D"/>
+          <w:kern w:val="0"/>
+          <w:sz w:val="36"/>
+          <w:szCs w:val="36"/>
+          <w:lang w:eastAsia="en-IN" w:bidi="ta-IN"/>
+          <w14:ligatures w14:val="none"/>
+        </w:rPr>
+        <w:t>Admin</w:t>
+      </w:r>
+      <w:proofErr w:type="gramEnd"/>
+      <w:r>
+        <w:rPr>
+          <w:rFonts w:eastAsia="Times New Roman" w:cstheme="minorHAnsi"/>
+          <w:color w:val="1D1C1D"/>
+          <w:kern w:val="0"/>
+          <w:sz w:val="36"/>
+          <w:szCs w:val="36"/>
+          <w:lang w:eastAsia="en-IN" w:bidi="ta-IN"/>
+          <w14:ligatures w14:val="none"/>
+        </w:rPr>
+        <w:t xml:space="preserve"> user can see the objects of the S3 bucket.</w:t>
       </w:r>
     </w:p>
     <w:p>
@@ -1911,6 +1937,7 @@
       <w:r>
         <w:rPr>
           <w:rFonts w:ascii="Arial" w:eastAsia="Times New Roman" w:hAnsi="Arial" w:cs="Arial"/>
+          <w:noProof/>
           <w:color w:val="1D1C1D"/>
           <w:kern w:val="0"/>
           <w:sz w:val="15"/>
@@ -2051,6 +2078,7 @@
       <w:r>
         <w:rPr>
           <w:rFonts w:eastAsia="Times New Roman" w:cstheme="minorHAnsi"/>
+          <w:noProof/>
           <w:color w:val="1D1C1D"/>
           <w:kern w:val="0"/>
           <w:sz w:val="28"/>
@@ -2114,6 +2142,7 @@
       <w:r>
         <w:rPr>
           <w:rFonts w:eastAsia="Times New Roman" w:cstheme="minorHAnsi"/>
+          <w:noProof/>
           <w:color w:val="1D1C1D"/>
           <w:kern w:val="0"/>
           <w:sz w:val="28"/>
@@ -2188,6 +2217,7 @@
       <w:r>
         <w:rPr>
           <w:rFonts w:cstheme="minorHAnsi"/>
+          <w:noProof/>
           <w:sz w:val="28"/>
           <w:szCs w:val="28"/>
         </w:rPr>
@@ -2295,6 +2325,7 @@
         </w:rPr>
         <w:sym w:font="Wingdings" w:char="F0E0"/>
       </w:r>
+      <w:proofErr w:type="spellStart"/>
       <w:r>
         <w:rPr>
           <w:rFonts w:cstheme="minorHAnsi"/>
@@ -2303,6 +2334,7 @@
         </w:rPr>
         <w:t>json</w:t>
       </w:r>
+      <w:proofErr w:type="spellEnd"/>
       <w:r>
         <w:rPr>
           <w:rFonts w:cstheme="minorHAnsi"/>
@@ -2365,6 +2397,7 @@
       <w:r>
         <w:rPr>
           <w:rFonts w:cstheme="minorHAnsi"/>
+          <w:noProof/>
           <w:sz w:val="28"/>
           <w:szCs w:val="28"/>
         </w:rPr>
@@ -2418,6 +2451,7 @@
       <w:r>
         <w:rPr>
           <w:rFonts w:cstheme="minorHAnsi"/>
+          <w:noProof/>
           <w:sz w:val="28"/>
           <w:szCs w:val="28"/>
         </w:rPr>
@@ -2471,6 +2505,7 @@
       <w:r>
         <w:rPr>
           <w:rFonts w:cstheme="minorHAnsi"/>
+          <w:noProof/>
           <w:sz w:val="28"/>
           <w:szCs w:val="28"/>
         </w:rPr>
@@ -2524,6 +2559,7 @@
       <w:r>
         <w:rPr>
           <w:rFonts w:cstheme="minorHAnsi"/>
+          <w:noProof/>
           <w:sz w:val="28"/>
           <w:szCs w:val="28"/>
         </w:rPr>
@@ -2578,6 +2614,7 @@
       <w:r>
         <w:rPr>
           <w:rFonts w:cstheme="minorHAnsi"/>
+          <w:noProof/>
           <w:sz w:val="28"/>
           <w:szCs w:val="28"/>
         </w:rPr>
@@ -2714,6 +2751,7 @@
       <w:r>
         <w:rPr>
           <w:rFonts w:cstheme="minorHAnsi"/>
+          <w:noProof/>
           <w:sz w:val="28"/>
           <w:szCs w:val="28"/>
         </w:rPr>
@@ -2767,6 +2805,7 @@
       <w:r>
         <w:rPr>
           <w:rFonts w:cstheme="minorHAnsi"/>
+          <w:noProof/>
           <w:sz w:val="28"/>
           <w:szCs w:val="28"/>
         </w:rPr>
@@ -2820,6 +2859,7 @@
       <w:r>
         <w:rPr>
           <w:rFonts w:cstheme="minorHAnsi"/>
+          <w:noProof/>
           <w:sz w:val="28"/>
           <w:szCs w:val="28"/>
         </w:rPr>
@@ -2970,98 +3010,2212 @@
           <w:lang w:eastAsia="en-IN" w:bidi="ta-IN"/>
           <w14:ligatures w14:val="none"/>
         </w:rPr>
+        <w:t xml:space="preserve">Step </w:t>
+      </w:r>
+      <w:proofErr w:type="gramStart"/>
+      <w:r>
+        <w:rPr>
+          <w:rFonts w:eastAsia="Times New Roman" w:cstheme="minorHAnsi"/>
+          <w:color w:val="1D1C1D"/>
+          <w:kern w:val="0"/>
+          <w:sz w:val="28"/>
+          <w:szCs w:val="28"/>
+          <w:lang w:eastAsia="en-IN" w:bidi="ta-IN"/>
+          <w14:ligatures w14:val="none"/>
+        </w:rPr>
+        <w:t>1:</w:t>
+      </w:r>
+      <w:r>
+        <w:rPr>
+          <w:rFonts w:eastAsia="Times New Roman" w:cstheme="minorHAnsi"/>
+          <w:color w:val="1D1C1D"/>
+          <w:kern w:val="0"/>
+          <w:sz w:val="28"/>
+          <w:szCs w:val="28"/>
+          <w:lang w:eastAsia="en-IN" w:bidi="ta-IN"/>
+          <w14:ligatures w14:val="none"/>
+        </w:rPr>
+        <w:t>Goto</w:t>
+      </w:r>
+      <w:proofErr w:type="gramEnd"/>
+      <w:r>
+        <w:rPr>
+          <w:rFonts w:eastAsia="Times New Roman" w:cstheme="minorHAnsi"/>
+          <w:color w:val="1D1C1D"/>
+          <w:kern w:val="0"/>
+          <w:sz w:val="28"/>
+          <w:szCs w:val="28"/>
+          <w:lang w:eastAsia="en-IN" w:bidi="ta-IN"/>
+          <w14:ligatures w14:val="none"/>
+        </w:rPr>
+        <w:t xml:space="preserve"> S3</w:t>
+      </w:r>
+      <w:r>
+        <w:rPr>
+          <w:rFonts w:eastAsia="Times New Roman" w:cstheme="minorHAnsi"/>
+          <w:color w:val="1D1C1D"/>
+          <w:kern w:val="0"/>
+          <w:sz w:val="28"/>
+          <w:szCs w:val="28"/>
+          <w:lang w:eastAsia="en-IN" w:bidi="ta-IN"/>
+          <w14:ligatures w14:val="none"/>
+        </w:rPr>
+        <w:sym w:font="Wingdings" w:char="F0E0"/>
+      </w:r>
+      <w:r>
+        <w:rPr>
+          <w:rFonts w:eastAsia="Times New Roman" w:cstheme="minorHAnsi"/>
+          <w:color w:val="1D1C1D"/>
+          <w:kern w:val="0"/>
+          <w:sz w:val="28"/>
+          <w:szCs w:val="28"/>
+          <w:lang w:eastAsia="en-IN" w:bidi="ta-IN"/>
+          <w14:ligatures w14:val="none"/>
+        </w:rPr>
+        <w:t>select bucket</w:t>
+      </w:r>
+      <w:r>
+        <w:rPr>
+          <w:rFonts w:eastAsia="Times New Roman" w:cstheme="minorHAnsi"/>
+          <w:color w:val="1D1C1D"/>
+          <w:kern w:val="0"/>
+          <w:sz w:val="28"/>
+          <w:szCs w:val="28"/>
+          <w:lang w:eastAsia="en-IN" w:bidi="ta-IN"/>
+          <w14:ligatures w14:val="none"/>
+        </w:rPr>
+        <w:sym w:font="Wingdings" w:char="F0E0"/>
+      </w:r>
+      <w:r>
+        <w:rPr>
+          <w:rFonts w:eastAsia="Times New Roman" w:cstheme="minorHAnsi"/>
+          <w:color w:val="1D1C1D"/>
+          <w:kern w:val="0"/>
+          <w:sz w:val="28"/>
+          <w:szCs w:val="28"/>
+          <w:lang w:eastAsia="en-IN" w:bidi="ta-IN"/>
+          <w14:ligatures w14:val="none"/>
+        </w:rPr>
+        <w:t>management</w:t>
+      </w:r>
+      <w:r>
+        <w:rPr>
+          <w:rFonts w:eastAsia="Times New Roman" w:cstheme="minorHAnsi"/>
+          <w:color w:val="1D1C1D"/>
+          <w:kern w:val="0"/>
+          <w:sz w:val="28"/>
+          <w:szCs w:val="28"/>
+          <w:lang w:eastAsia="en-IN" w:bidi="ta-IN"/>
+          <w14:ligatures w14:val="none"/>
+        </w:rPr>
+        <w:sym w:font="Wingdings" w:char="F0E0"/>
+      </w:r>
+      <w:r>
+        <w:rPr>
+          <w:rFonts w:eastAsia="Times New Roman" w:cstheme="minorHAnsi"/>
+          <w:color w:val="1D1C1D"/>
+          <w:kern w:val="0"/>
+          <w:sz w:val="28"/>
+          <w:szCs w:val="28"/>
+          <w:lang w:eastAsia="en-IN" w:bidi="ta-IN"/>
+          <w14:ligatures w14:val="none"/>
+        </w:rPr>
+        <w:t>create lifecycle rule.</w:t>
+      </w:r>
+    </w:p>
+    <w:p>
+      <w:pPr>
+        <w:pStyle w:val="ListParagraph"/>
+        <w:shd w:val="clear" w:color="auto" w:fill="F8F8F8"/>
+        <w:spacing w:before="100" w:beforeAutospacing="1" w:after="0" w:line="240" w:lineRule="auto"/>
+        <w:ind w:left="142"/>
+        <w:rPr>
+          <w:rFonts w:eastAsia="Times New Roman" w:cstheme="minorHAnsi"/>
+          <w:color w:val="1D1C1D"/>
+          <w:kern w:val="0"/>
+          <w:sz w:val="28"/>
+          <w:szCs w:val="28"/>
+          <w:lang w:eastAsia="en-IN" w:bidi="ta-IN"/>
+          <w14:ligatures w14:val="none"/>
+        </w:rPr>
+      </w:pPr>
+      <w:r>
+        <w:rPr>
+          <w:rFonts w:eastAsia="Times New Roman" w:cstheme="minorHAnsi"/>
+          <w:noProof/>
+          <w:color w:val="1D1C1D"/>
+          <w:kern w:val="0"/>
+          <w:sz w:val="28"/>
+          <w:szCs w:val="28"/>
+          <w:lang w:eastAsia="en-IN" w:bidi="ta-IN"/>
+          <w14:ligatures w14:val="none"/>
+        </w:rPr>
+        <w:drawing>
+          <wp:inline distT="0" distB="0" distL="0" distR="0" wp14:anchorId="7FF7F9AD" wp14:editId="4A87FA76">
+            <wp:extent cx="7110730" cy="2439035"/>
+            <wp:effectExtent l="0" t="0" r="0" b="0"/>
+            <wp:docPr id="850764700" name="Picture 1"/>
+            <wp:cNvGraphicFramePr>
+              <a:graphicFrameLocks xmlns:a="http://schemas.openxmlformats.org/drawingml/2006/main" noChangeAspect="1"/>
+            </wp:cNvGraphicFramePr>
+            <a:graphic xmlns:a="http://schemas.openxmlformats.org/drawingml/2006/main">
+              <a:graphicData uri="http://schemas.openxmlformats.org/drawingml/2006/picture">
+                <pic:pic xmlns:pic="http://schemas.openxmlformats.org/drawingml/2006/picture">
+                  <pic:nvPicPr>
+                    <pic:cNvPr id="850764700" name=""/>
+                    <pic:cNvPicPr/>
+                  </pic:nvPicPr>
+                  <pic:blipFill>
+                    <a:blip r:embed="rId36"/>
+                    <a:stretch>
+                      <a:fillRect/>
+                    </a:stretch>
+                  </pic:blipFill>
+                  <pic:spPr>
+                    <a:xfrm>
+                      <a:off x="0" y="0"/>
+                      <a:ext cx="7110730" cy="2439035"/>
+                    </a:xfrm>
+                    <a:prstGeom prst="rect">
+                      <a:avLst/>
+                    </a:prstGeom>
+                  </pic:spPr>
+                </pic:pic>
+              </a:graphicData>
+            </a:graphic>
+          </wp:inline>
+        </w:drawing>
+      </w:r>
+    </w:p>
+    <w:p>
+      <w:pPr>
+        <w:pStyle w:val="ListParagraph"/>
+        <w:shd w:val="clear" w:color="auto" w:fill="F8F8F8"/>
+        <w:spacing w:before="100" w:beforeAutospacing="1" w:after="0" w:line="240" w:lineRule="auto"/>
+        <w:ind w:left="142"/>
+        <w:rPr>
+          <w:rFonts w:eastAsia="Times New Roman" w:cstheme="minorHAnsi"/>
+          <w:color w:val="1D1C1D"/>
+          <w:kern w:val="0"/>
+          <w:sz w:val="28"/>
+          <w:szCs w:val="28"/>
+          <w:lang w:eastAsia="en-IN" w:bidi="ta-IN"/>
+          <w14:ligatures w14:val="none"/>
+        </w:rPr>
+      </w:pPr>
+      <w:r>
+        <w:rPr>
+          <w:rFonts w:eastAsia="Times New Roman" w:cstheme="minorHAnsi"/>
+          <w:color w:val="1D1C1D"/>
+          <w:kern w:val="0"/>
+          <w:sz w:val="28"/>
+          <w:szCs w:val="28"/>
+          <w:lang w:eastAsia="en-IN" w:bidi="ta-IN"/>
+          <w14:ligatures w14:val="none"/>
+        </w:rPr>
+        <w:t xml:space="preserve">Step 2: </w:t>
+      </w:r>
+    </w:p>
+    <w:p>
+      <w:pPr>
+        <w:pStyle w:val="ListParagraph"/>
+        <w:shd w:val="clear" w:color="auto" w:fill="F8F8F8"/>
+        <w:spacing w:before="100" w:beforeAutospacing="1" w:after="0" w:line="240" w:lineRule="auto"/>
+        <w:ind w:left="142"/>
+        <w:rPr>
+          <w:rFonts w:eastAsia="Times New Roman" w:cstheme="minorHAnsi"/>
+          <w:color w:val="1D1C1D"/>
+          <w:kern w:val="0"/>
+          <w:sz w:val="28"/>
+          <w:szCs w:val="28"/>
+          <w:lang w:eastAsia="en-IN" w:bidi="ta-IN"/>
+          <w14:ligatures w14:val="none"/>
+        </w:rPr>
+      </w:pPr>
+      <w:r>
+        <w:rPr>
+          <w:rFonts w:eastAsia="Times New Roman" w:cstheme="minorHAnsi"/>
+          <w:noProof/>
+          <w:color w:val="1D1C1D"/>
+          <w:kern w:val="0"/>
+          <w:sz w:val="28"/>
+          <w:szCs w:val="28"/>
+          <w:lang w:eastAsia="en-IN" w:bidi="ta-IN"/>
+          <w14:ligatures w14:val="none"/>
+        </w:rPr>
+        <w:drawing>
+          <wp:inline distT="0" distB="0" distL="0" distR="0" wp14:anchorId="45212F55" wp14:editId="76DDF221">
+            <wp:extent cx="7110730" cy="2538095"/>
+            <wp:effectExtent l="0" t="0" r="0" b="0"/>
+            <wp:docPr id="1918172865" name="Picture 1"/>
+            <wp:cNvGraphicFramePr>
+              <a:graphicFrameLocks xmlns:a="http://schemas.openxmlformats.org/drawingml/2006/main" noChangeAspect="1"/>
+            </wp:cNvGraphicFramePr>
+            <a:graphic xmlns:a="http://schemas.openxmlformats.org/drawingml/2006/main">
+              <a:graphicData uri="http://schemas.openxmlformats.org/drawingml/2006/picture">
+                <pic:pic xmlns:pic="http://schemas.openxmlformats.org/drawingml/2006/picture">
+                  <pic:nvPicPr>
+                    <pic:cNvPr id="1918172865" name=""/>
+                    <pic:cNvPicPr/>
+                  </pic:nvPicPr>
+                  <pic:blipFill>
+                    <a:blip r:embed="rId37"/>
+                    <a:stretch>
+                      <a:fillRect/>
+                    </a:stretch>
+                  </pic:blipFill>
+                  <pic:spPr>
+                    <a:xfrm>
+                      <a:off x="0" y="0"/>
+                      <a:ext cx="7110730" cy="2538095"/>
+                    </a:xfrm>
+                    <a:prstGeom prst="rect">
+                      <a:avLst/>
+                    </a:prstGeom>
+                  </pic:spPr>
+                </pic:pic>
+              </a:graphicData>
+            </a:graphic>
+          </wp:inline>
+        </w:drawing>
+      </w:r>
+    </w:p>
+    <w:p>
+      <w:pPr>
+        <w:pStyle w:val="ListParagraph"/>
+        <w:shd w:val="clear" w:color="auto" w:fill="F8F8F8"/>
+        <w:spacing w:before="100" w:beforeAutospacing="1" w:after="0" w:line="240" w:lineRule="auto"/>
+        <w:ind w:left="142"/>
+        <w:rPr>
+          <w:rFonts w:eastAsia="Times New Roman" w:cstheme="minorHAnsi"/>
+          <w:color w:val="1D1C1D"/>
+          <w:kern w:val="0"/>
+          <w:sz w:val="28"/>
+          <w:szCs w:val="28"/>
+          <w:lang w:eastAsia="en-IN" w:bidi="ta-IN"/>
+          <w14:ligatures w14:val="none"/>
+        </w:rPr>
+      </w:pPr>
+      <w:r>
+        <w:rPr>
+          <w:rFonts w:eastAsia="Times New Roman" w:cstheme="minorHAnsi"/>
+          <w:noProof/>
+          <w:color w:val="1D1C1D"/>
+          <w:kern w:val="0"/>
+          <w:sz w:val="28"/>
+          <w:szCs w:val="28"/>
+          <w:lang w:eastAsia="en-IN" w:bidi="ta-IN"/>
+          <w14:ligatures w14:val="none"/>
+        </w:rPr>
+        <w:drawing>
+          <wp:inline distT="0" distB="0" distL="0" distR="0" wp14:anchorId="1D88EA34" wp14:editId="759C4828">
+            <wp:extent cx="7110730" cy="1386205"/>
+            <wp:effectExtent l="0" t="0" r="0" b="4445"/>
+            <wp:docPr id="54972316" name="Picture 1"/>
+            <wp:cNvGraphicFramePr>
+              <a:graphicFrameLocks xmlns:a="http://schemas.openxmlformats.org/drawingml/2006/main" noChangeAspect="1"/>
+            </wp:cNvGraphicFramePr>
+            <a:graphic xmlns:a="http://schemas.openxmlformats.org/drawingml/2006/main">
+              <a:graphicData uri="http://schemas.openxmlformats.org/drawingml/2006/picture">
+                <pic:pic xmlns:pic="http://schemas.openxmlformats.org/drawingml/2006/picture">
+                  <pic:nvPicPr>
+                    <pic:cNvPr id="54972316" name=""/>
+                    <pic:cNvPicPr/>
+                  </pic:nvPicPr>
+                  <pic:blipFill>
+                    <a:blip r:embed="rId38"/>
+                    <a:stretch>
+                      <a:fillRect/>
+                    </a:stretch>
+                  </pic:blipFill>
+                  <pic:spPr>
+                    <a:xfrm>
+                      <a:off x="0" y="0"/>
+                      <a:ext cx="7110730" cy="1386205"/>
+                    </a:xfrm>
+                    <a:prstGeom prst="rect">
+                      <a:avLst/>
+                    </a:prstGeom>
+                  </pic:spPr>
+                </pic:pic>
+              </a:graphicData>
+            </a:graphic>
+          </wp:inline>
+        </w:drawing>
+      </w:r>
+    </w:p>
+    <w:p>
+      <w:pPr>
+        <w:pStyle w:val="ListParagraph"/>
+        <w:shd w:val="clear" w:color="auto" w:fill="F8F8F8"/>
+        <w:spacing w:before="100" w:beforeAutospacing="1" w:after="0" w:line="240" w:lineRule="auto"/>
+        <w:ind w:left="142"/>
+        <w:rPr>
+          <w:rFonts w:eastAsia="Times New Roman" w:cstheme="minorHAnsi"/>
+          <w:color w:val="1D1C1D"/>
+          <w:kern w:val="0"/>
+          <w:sz w:val="28"/>
+          <w:szCs w:val="28"/>
+          <w:lang w:eastAsia="en-IN" w:bidi="ta-IN"/>
+          <w14:ligatures w14:val="none"/>
+        </w:rPr>
+      </w:pPr>
+      <w:r>
+        <w:rPr>
+          <w:rFonts w:eastAsia="Times New Roman" w:cstheme="minorHAnsi"/>
+          <w:noProof/>
+          <w:color w:val="1D1C1D"/>
+          <w:kern w:val="0"/>
+          <w:sz w:val="28"/>
+          <w:szCs w:val="28"/>
+          <w:lang w:eastAsia="en-IN" w:bidi="ta-IN"/>
+          <w14:ligatures w14:val="none"/>
+        </w:rPr>
+        <w:drawing>
+          <wp:inline distT="0" distB="0" distL="0" distR="0" wp14:anchorId="3B83FAE4" wp14:editId="4B65CFB6">
+            <wp:extent cx="7110730" cy="2303780"/>
+            <wp:effectExtent l="0" t="0" r="0" b="1270"/>
+            <wp:docPr id="252500772" name="Picture 1"/>
+            <wp:cNvGraphicFramePr>
+              <a:graphicFrameLocks xmlns:a="http://schemas.openxmlformats.org/drawingml/2006/main" noChangeAspect="1"/>
+            </wp:cNvGraphicFramePr>
+            <a:graphic xmlns:a="http://schemas.openxmlformats.org/drawingml/2006/main">
+              <a:graphicData uri="http://schemas.openxmlformats.org/drawingml/2006/picture">
+                <pic:pic xmlns:pic="http://schemas.openxmlformats.org/drawingml/2006/picture">
+                  <pic:nvPicPr>
+                    <pic:cNvPr id="252500772" name=""/>
+                    <pic:cNvPicPr/>
+                  </pic:nvPicPr>
+                  <pic:blipFill>
+                    <a:blip r:embed="rId39"/>
+                    <a:stretch>
+                      <a:fillRect/>
+                    </a:stretch>
+                  </pic:blipFill>
+                  <pic:spPr>
+                    <a:xfrm>
+                      <a:off x="0" y="0"/>
+                      <a:ext cx="7110730" cy="2303780"/>
+                    </a:xfrm>
+                    <a:prstGeom prst="rect">
+                      <a:avLst/>
+                    </a:prstGeom>
+                  </pic:spPr>
+                </pic:pic>
+              </a:graphicData>
+            </a:graphic>
+          </wp:inline>
+        </w:drawing>
+      </w:r>
+    </w:p>
+    <w:p>
+      <w:pPr>
+        <w:pStyle w:val="ListParagraph"/>
+        <w:shd w:val="clear" w:color="auto" w:fill="F8F8F8"/>
+        <w:spacing w:before="100" w:beforeAutospacing="1" w:after="0" w:line="240" w:lineRule="auto"/>
+        <w:ind w:left="142"/>
+        <w:rPr>
+          <w:rFonts w:eastAsia="Times New Roman" w:cstheme="minorHAnsi"/>
+          <w:color w:val="1D1C1D"/>
+          <w:kern w:val="0"/>
+          <w:sz w:val="28"/>
+          <w:szCs w:val="28"/>
+          <w:lang w:eastAsia="en-IN" w:bidi="ta-IN"/>
+          <w14:ligatures w14:val="none"/>
+        </w:rPr>
+      </w:pPr>
+      <w:r>
+        <w:rPr>
+          <w:rFonts w:eastAsia="Times New Roman" w:cstheme="minorHAnsi"/>
+          <w:noProof/>
+          <w:color w:val="1D1C1D"/>
+          <w:kern w:val="0"/>
+          <w:sz w:val="28"/>
+          <w:szCs w:val="28"/>
+          <w:lang w:eastAsia="en-IN" w:bidi="ta-IN"/>
+          <w14:ligatures w14:val="none"/>
+        </w:rPr>
+        <w:lastRenderedPageBreak/>
+        <w:drawing>
+          <wp:inline distT="0" distB="0" distL="0" distR="0" wp14:anchorId="6B36FC52" wp14:editId="535F2FC5">
+            <wp:extent cx="7110730" cy="2486025"/>
+            <wp:effectExtent l="0" t="0" r="0" b="9525"/>
+            <wp:docPr id="1547241152" name="Picture 1"/>
+            <wp:cNvGraphicFramePr>
+              <a:graphicFrameLocks xmlns:a="http://schemas.openxmlformats.org/drawingml/2006/main" noChangeAspect="1"/>
+            </wp:cNvGraphicFramePr>
+            <a:graphic xmlns:a="http://schemas.openxmlformats.org/drawingml/2006/main">
+              <a:graphicData uri="http://schemas.openxmlformats.org/drawingml/2006/picture">
+                <pic:pic xmlns:pic="http://schemas.openxmlformats.org/drawingml/2006/picture">
+                  <pic:nvPicPr>
+                    <pic:cNvPr id="1547241152" name=""/>
+                    <pic:cNvPicPr/>
+                  </pic:nvPicPr>
+                  <pic:blipFill>
+                    <a:blip r:embed="rId40"/>
+                    <a:stretch>
+                      <a:fillRect/>
+                    </a:stretch>
+                  </pic:blipFill>
+                  <pic:spPr>
+                    <a:xfrm>
+                      <a:off x="0" y="0"/>
+                      <a:ext cx="7110730" cy="2486025"/>
+                    </a:xfrm>
+                    <a:prstGeom prst="rect">
+                      <a:avLst/>
+                    </a:prstGeom>
+                  </pic:spPr>
+                </pic:pic>
+              </a:graphicData>
+            </a:graphic>
+          </wp:inline>
+        </w:drawing>
+      </w:r>
+    </w:p>
+    <w:p>
+      <w:pPr>
+        <w:pStyle w:val="ListParagraph"/>
+        <w:shd w:val="clear" w:color="auto" w:fill="F8F8F8"/>
+        <w:spacing w:before="100" w:beforeAutospacing="1" w:after="0" w:line="240" w:lineRule="auto"/>
+        <w:ind w:left="142"/>
+        <w:rPr>
+          <w:rFonts w:eastAsia="Times New Roman" w:cstheme="minorHAnsi"/>
+          <w:color w:val="1D1C1D"/>
+          <w:kern w:val="0"/>
+          <w:sz w:val="28"/>
+          <w:szCs w:val="28"/>
+          <w:lang w:eastAsia="en-IN" w:bidi="ta-IN"/>
+          <w14:ligatures w14:val="none"/>
+        </w:rPr>
+      </w:pPr>
+    </w:p>
+    <w:p>
+      <w:pPr>
+        <w:pStyle w:val="ListParagraph"/>
+        <w:numPr>
+          <w:ilvl w:val="0"/>
+          <w:numId w:val="1"/>
+        </w:numPr>
+        <w:shd w:val="clear" w:color="auto" w:fill="F8F8F8"/>
+        <w:tabs>
+          <w:tab w:val="clear" w:pos="720"/>
+          <w:tab w:val="num" w:pos="0"/>
+        </w:tabs>
+        <w:spacing w:before="100" w:beforeAutospacing="1" w:after="0" w:line="240" w:lineRule="auto"/>
+        <w:ind w:hanging="1004"/>
+        <w:rPr>
+          <w:rFonts w:eastAsia="Times New Roman" w:cstheme="minorHAnsi"/>
+          <w:color w:val="1D1C1D"/>
+          <w:kern w:val="0"/>
+          <w:sz w:val="36"/>
+          <w:szCs w:val="36"/>
+          <w:lang w:eastAsia="en-IN" w:bidi="ta-IN"/>
+          <w14:ligatures w14:val="none"/>
+        </w:rPr>
+      </w:pPr>
+      <w:r>
+        <w:rPr>
+          <w:rFonts w:eastAsia="Times New Roman" w:cstheme="minorHAnsi"/>
+          <w:color w:val="1D1C1D"/>
+          <w:kern w:val="0"/>
+          <w:sz w:val="36"/>
+          <w:szCs w:val="36"/>
+          <w:lang w:eastAsia="en-IN" w:bidi="ta-IN"/>
+          <w14:ligatures w14:val="none"/>
+        </w:rPr>
+        <w:t>Push some objects to S3 using the AWS CLI.</w:t>
+      </w:r>
+    </w:p>
+    <w:p>
+      <w:pPr>
+        <w:pStyle w:val="ListParagraph"/>
+        <w:shd w:val="clear" w:color="auto" w:fill="F8F8F8"/>
+        <w:spacing w:before="100" w:beforeAutospacing="1" w:after="0" w:line="240" w:lineRule="auto"/>
+        <w:ind w:left="0"/>
+        <w:rPr>
+          <w:rFonts w:eastAsia="Times New Roman" w:cstheme="minorHAnsi"/>
+          <w:color w:val="1D1C1D"/>
+          <w:kern w:val="0"/>
+          <w:sz w:val="28"/>
+          <w:szCs w:val="28"/>
+          <w:lang w:eastAsia="en-IN" w:bidi="ta-IN"/>
+          <w14:ligatures w14:val="none"/>
+        </w:rPr>
+      </w:pPr>
+      <w:r>
+        <w:rPr>
+          <w:rFonts w:eastAsia="Times New Roman" w:cstheme="minorHAnsi"/>
+          <w:color w:val="1D1C1D"/>
+          <w:kern w:val="0"/>
+          <w:sz w:val="28"/>
+          <w:szCs w:val="28"/>
+          <w:lang w:eastAsia="en-IN" w:bidi="ta-IN"/>
+          <w14:ligatures w14:val="none"/>
+        </w:rPr>
         <w:t>Step 1:</w:t>
       </w:r>
-    </w:p>
-    <w:p>
-      <w:pPr>
-        <w:pStyle w:val="ListParagraph"/>
-        <w:ind w:left="-142"/>
-        <w:rPr>
-          <w:rFonts w:cstheme="minorHAnsi"/>
-          <w:sz w:val="28"/>
-          <w:szCs w:val="28"/>
-        </w:rPr>
-      </w:pPr>
-    </w:p>
-    <w:p>
-      <w:pPr>
-        <w:pStyle w:val="ListParagraph"/>
-        <w:ind w:left="-142"/>
-        <w:rPr>
-          <w:rFonts w:cstheme="minorHAnsi"/>
-          <w:sz w:val="28"/>
-          <w:szCs w:val="28"/>
-        </w:rPr>
-      </w:pPr>
-    </w:p>
-    <w:p>
-      <w:pPr>
-        <w:pStyle w:val="ListParagraph"/>
-        <w:ind w:left="-142"/>
-        <w:rPr>
-          <w:rFonts w:cstheme="minorHAnsi"/>
-          <w:sz w:val="28"/>
-          <w:szCs w:val="28"/>
-        </w:rPr>
-      </w:pPr>
-    </w:p>
-    <w:p>
-      <w:pPr>
-        <w:pStyle w:val="ListParagraph"/>
-        <w:ind w:left="-142"/>
-        <w:rPr>
-          <w:rFonts w:cstheme="minorHAnsi"/>
-          <w:sz w:val="28"/>
-          <w:szCs w:val="28"/>
-        </w:rPr>
-      </w:pPr>
-    </w:p>
-    <w:p>
-      <w:pPr>
-        <w:pStyle w:val="ListParagraph"/>
-        <w:ind w:left="-142"/>
-        <w:rPr>
-          <w:rFonts w:cstheme="minorHAnsi"/>
-          <w:sz w:val="28"/>
-          <w:szCs w:val="28"/>
-        </w:rPr>
-      </w:pPr>
-    </w:p>
-    <w:p>
-      <w:pPr>
-        <w:pStyle w:val="ListParagraph"/>
-        <w:ind w:left="-142"/>
-        <w:rPr>
-          <w:rFonts w:cstheme="minorHAnsi"/>
-          <w:sz w:val="28"/>
-          <w:szCs w:val="28"/>
-        </w:rPr>
-      </w:pPr>
-    </w:p>
-    <w:p>
-      <w:pPr>
-        <w:pStyle w:val="ListParagraph"/>
-        <w:ind w:left="-142"/>
-        <w:rPr>
-          <w:rFonts w:cstheme="minorHAnsi"/>
-          <w:sz w:val="28"/>
-          <w:szCs w:val="28"/>
-        </w:rPr>
-      </w:pPr>
-    </w:p>
-    <w:p>
-      <w:pPr>
-        <w:pStyle w:val="ListParagraph"/>
+      <w:r>
+        <w:rPr>
+          <w:rFonts w:eastAsia="Times New Roman" w:cstheme="minorHAnsi"/>
+          <w:color w:val="1D1C1D"/>
+          <w:kern w:val="0"/>
+          <w:sz w:val="28"/>
+          <w:szCs w:val="28"/>
+          <w:lang w:eastAsia="en-IN" w:bidi="ta-IN"/>
+          <w14:ligatures w14:val="none"/>
+        </w:rPr>
+        <w:t xml:space="preserve"> </w:t>
+      </w:r>
+      <w:r>
+        <w:rPr>
+          <w:rFonts w:eastAsia="Times New Roman" w:cstheme="minorHAnsi"/>
+          <w:color w:val="1D1C1D"/>
+          <w:kern w:val="0"/>
+          <w:sz w:val="28"/>
+          <w:szCs w:val="28"/>
+          <w:lang w:eastAsia="en-IN" w:bidi="ta-IN"/>
+          <w14:ligatures w14:val="none"/>
+        </w:rPr>
+        <w:t>Configure EC2 instance with Access key and sec</w:t>
+      </w:r>
+      <w:r>
+        <w:rPr>
+          <w:rFonts w:eastAsia="Times New Roman" w:cstheme="minorHAnsi"/>
+          <w:color w:val="1D1C1D"/>
+          <w:kern w:val="0"/>
+          <w:sz w:val="28"/>
+          <w:szCs w:val="28"/>
+          <w:lang w:eastAsia="en-IN" w:bidi="ta-IN"/>
+          <w14:ligatures w14:val="none"/>
+        </w:rPr>
+        <w:t>ret</w:t>
+      </w:r>
+      <w:r>
+        <w:rPr>
+          <w:rFonts w:eastAsia="Times New Roman" w:cstheme="minorHAnsi"/>
+          <w:color w:val="1D1C1D"/>
+          <w:kern w:val="0"/>
+          <w:sz w:val="28"/>
+          <w:szCs w:val="28"/>
+          <w:lang w:eastAsia="en-IN" w:bidi="ta-IN"/>
+          <w14:ligatures w14:val="none"/>
+        </w:rPr>
+        <w:t xml:space="preserve"> key using </w:t>
+      </w:r>
+      <w:proofErr w:type="spellStart"/>
+      <w:r>
+        <w:rPr>
+          <w:rFonts w:eastAsia="Times New Roman" w:cstheme="minorHAnsi"/>
+          <w:b/>
+          <w:bCs/>
+          <w:color w:val="1D1C1D"/>
+          <w:kern w:val="0"/>
+          <w:sz w:val="28"/>
+          <w:szCs w:val="28"/>
+          <w:lang w:eastAsia="en-IN" w:bidi="ta-IN"/>
+          <w14:ligatures w14:val="none"/>
+        </w:rPr>
+        <w:t>aws</w:t>
+      </w:r>
+      <w:proofErr w:type="spellEnd"/>
+      <w:r>
+        <w:rPr>
+          <w:rFonts w:eastAsia="Times New Roman" w:cstheme="minorHAnsi"/>
+          <w:b/>
+          <w:bCs/>
+          <w:color w:val="1D1C1D"/>
+          <w:kern w:val="0"/>
+          <w:sz w:val="28"/>
+          <w:szCs w:val="28"/>
+          <w:lang w:eastAsia="en-IN" w:bidi="ta-IN"/>
+          <w14:ligatures w14:val="none"/>
+        </w:rPr>
+        <w:t xml:space="preserve"> configure </w:t>
+      </w:r>
+      <w:r>
+        <w:rPr>
+          <w:rFonts w:eastAsia="Times New Roman" w:cstheme="minorHAnsi"/>
+          <w:color w:val="1D1C1D"/>
+          <w:kern w:val="0"/>
+          <w:sz w:val="28"/>
+          <w:szCs w:val="28"/>
+          <w:lang w:eastAsia="en-IN" w:bidi="ta-IN"/>
+          <w14:ligatures w14:val="none"/>
+        </w:rPr>
+        <w:t>command.</w:t>
+      </w:r>
+    </w:p>
+    <w:p>
+      <w:pPr>
+        <w:pStyle w:val="ListParagraph"/>
+        <w:shd w:val="clear" w:color="auto" w:fill="F8F8F8"/>
+        <w:spacing w:before="100" w:beforeAutospacing="1" w:after="0" w:line="240" w:lineRule="auto"/>
+        <w:ind w:left="0"/>
+        <w:rPr>
+          <w:rFonts w:eastAsia="Times New Roman" w:cstheme="minorHAnsi"/>
+          <w:color w:val="1D1C1D"/>
+          <w:kern w:val="0"/>
+          <w:sz w:val="28"/>
+          <w:szCs w:val="28"/>
+          <w:lang w:eastAsia="en-IN" w:bidi="ta-IN"/>
+          <w14:ligatures w14:val="none"/>
+        </w:rPr>
+      </w:pPr>
+      <w:r>
+        <w:rPr>
+          <w:rFonts w:eastAsia="Times New Roman" w:cstheme="minorHAnsi"/>
+          <w:color w:val="1D1C1D"/>
+          <w:kern w:val="0"/>
+          <w:sz w:val="28"/>
+          <w:szCs w:val="28"/>
+          <w:lang w:eastAsia="en-IN" w:bidi="ta-IN"/>
+          <w14:ligatures w14:val="none"/>
+        </w:rPr>
+        <w:drawing>
+          <wp:inline distT="0" distB="0" distL="0" distR="0" wp14:anchorId="222C5821" wp14:editId="1A3DA7CF">
+            <wp:extent cx="6677957" cy="1667108"/>
+            <wp:effectExtent l="0" t="0" r="0" b="9525"/>
+            <wp:docPr id="571298960" name="Picture 1"/>
+            <wp:cNvGraphicFramePr>
+              <a:graphicFrameLocks xmlns:a="http://schemas.openxmlformats.org/drawingml/2006/main" noChangeAspect="1"/>
+            </wp:cNvGraphicFramePr>
+            <a:graphic xmlns:a="http://schemas.openxmlformats.org/drawingml/2006/main">
+              <a:graphicData uri="http://schemas.openxmlformats.org/drawingml/2006/picture">
+                <pic:pic xmlns:pic="http://schemas.openxmlformats.org/drawingml/2006/picture">
+                  <pic:nvPicPr>
+                    <pic:cNvPr id="571298960" name=""/>
+                    <pic:cNvPicPr/>
+                  </pic:nvPicPr>
+                  <pic:blipFill>
+                    <a:blip r:embed="rId41"/>
+                    <a:stretch>
+                      <a:fillRect/>
+                    </a:stretch>
+                  </pic:blipFill>
+                  <pic:spPr>
+                    <a:xfrm>
+                      <a:off x="0" y="0"/>
+                      <a:ext cx="6677957" cy="1667108"/>
+                    </a:xfrm>
+                    <a:prstGeom prst="rect">
+                      <a:avLst/>
+                    </a:prstGeom>
+                  </pic:spPr>
+                </pic:pic>
+              </a:graphicData>
+            </a:graphic>
+          </wp:inline>
+        </w:drawing>
+      </w:r>
+    </w:p>
+    <w:p>
+      <w:pPr>
+        <w:pStyle w:val="ListParagraph"/>
+        <w:shd w:val="clear" w:color="auto" w:fill="F8F8F8"/>
+        <w:spacing w:before="100" w:beforeAutospacing="1" w:after="0" w:line="240" w:lineRule="auto"/>
+        <w:ind w:left="0"/>
+        <w:rPr>
+          <w:rFonts w:eastAsia="Times New Roman" w:cstheme="minorHAnsi"/>
+          <w:color w:val="1D1C1D"/>
+          <w:kern w:val="0"/>
+          <w:sz w:val="28"/>
+          <w:szCs w:val="28"/>
+          <w:lang w:eastAsia="en-IN" w:bidi="ta-IN"/>
+          <w14:ligatures w14:val="none"/>
+        </w:rPr>
+      </w:pPr>
+      <w:r>
+        <w:rPr>
+          <w:rFonts w:eastAsia="Times New Roman" w:cstheme="minorHAnsi"/>
+          <w:color w:val="1D1C1D"/>
+          <w:kern w:val="0"/>
+          <w:sz w:val="28"/>
+          <w:szCs w:val="28"/>
+          <w:lang w:eastAsia="en-IN" w:bidi="ta-IN"/>
+          <w14:ligatures w14:val="none"/>
+        </w:rPr>
+        <w:t xml:space="preserve">Step 2: use command </w:t>
+      </w:r>
+      <w:proofErr w:type="spellStart"/>
+      <w:r>
+        <w:rPr>
+          <w:rFonts w:eastAsia="Times New Roman" w:cstheme="minorHAnsi"/>
+          <w:b/>
+          <w:bCs/>
+          <w:color w:val="1D1C1D"/>
+          <w:kern w:val="0"/>
+          <w:sz w:val="28"/>
+          <w:szCs w:val="28"/>
+          <w:lang w:eastAsia="en-IN" w:bidi="ta-IN"/>
+          <w14:ligatures w14:val="none"/>
+        </w:rPr>
+        <w:t>aws</w:t>
+      </w:r>
+      <w:proofErr w:type="spellEnd"/>
+      <w:r>
+        <w:rPr>
+          <w:rFonts w:eastAsia="Times New Roman" w:cstheme="minorHAnsi"/>
+          <w:b/>
+          <w:bCs/>
+          <w:color w:val="1D1C1D"/>
+          <w:kern w:val="0"/>
+          <w:sz w:val="28"/>
+          <w:szCs w:val="28"/>
+          <w:lang w:eastAsia="en-IN" w:bidi="ta-IN"/>
+          <w14:ligatures w14:val="none"/>
+        </w:rPr>
+        <w:t xml:space="preserve"> s3 cp path_to_local_file.txt s3://bucket-name/object_name.</w:t>
+      </w:r>
+    </w:p>
+    <w:p>
+      <w:pPr>
+        <w:pStyle w:val="ListParagraph"/>
+        <w:shd w:val="clear" w:color="auto" w:fill="F8F8F8"/>
+        <w:spacing w:before="100" w:beforeAutospacing="1" w:after="0" w:line="240" w:lineRule="auto"/>
+        <w:ind w:left="0"/>
+        <w:rPr>
+          <w:rFonts w:eastAsia="Times New Roman" w:cstheme="minorHAnsi"/>
+          <w:color w:val="1D1C1D"/>
+          <w:kern w:val="0"/>
+          <w:sz w:val="28"/>
+          <w:szCs w:val="28"/>
+          <w:lang w:eastAsia="en-IN" w:bidi="ta-IN"/>
+          <w14:ligatures w14:val="none"/>
+        </w:rPr>
+      </w:pPr>
+      <w:r>
+        <w:rPr>
+          <w:rFonts w:eastAsia="Times New Roman" w:cstheme="minorHAnsi"/>
+          <w:color w:val="1D1C1D"/>
+          <w:kern w:val="0"/>
+          <w:sz w:val="28"/>
+          <w:szCs w:val="28"/>
+          <w:lang w:eastAsia="en-IN" w:bidi="ta-IN"/>
+          <w14:ligatures w14:val="none"/>
+        </w:rPr>
+        <w:drawing>
+          <wp:inline distT="0" distB="0" distL="0" distR="0" wp14:anchorId="241C46E2" wp14:editId="1C36E86E">
+            <wp:extent cx="7110730" cy="1404620"/>
+            <wp:effectExtent l="0" t="0" r="0" b="5080"/>
+            <wp:docPr id="726077186" name="Picture 1"/>
+            <wp:cNvGraphicFramePr>
+              <a:graphicFrameLocks xmlns:a="http://schemas.openxmlformats.org/drawingml/2006/main" noChangeAspect="1"/>
+            </wp:cNvGraphicFramePr>
+            <a:graphic xmlns:a="http://schemas.openxmlformats.org/drawingml/2006/main">
+              <a:graphicData uri="http://schemas.openxmlformats.org/drawingml/2006/picture">
+                <pic:pic xmlns:pic="http://schemas.openxmlformats.org/drawingml/2006/picture">
+                  <pic:nvPicPr>
+                    <pic:cNvPr id="726077186" name=""/>
+                    <pic:cNvPicPr/>
+                  </pic:nvPicPr>
+                  <pic:blipFill>
+                    <a:blip r:embed="rId42"/>
+                    <a:stretch>
+                      <a:fillRect/>
+                    </a:stretch>
+                  </pic:blipFill>
+                  <pic:spPr>
+                    <a:xfrm>
+                      <a:off x="0" y="0"/>
+                      <a:ext cx="7110730" cy="1404620"/>
+                    </a:xfrm>
+                    <a:prstGeom prst="rect">
+                      <a:avLst/>
+                    </a:prstGeom>
+                  </pic:spPr>
+                </pic:pic>
+              </a:graphicData>
+            </a:graphic>
+          </wp:inline>
+        </w:drawing>
+      </w:r>
+    </w:p>
+    <w:p>
+      <w:pPr>
+        <w:pStyle w:val="ListParagraph"/>
+        <w:shd w:val="clear" w:color="auto" w:fill="F8F8F8"/>
+        <w:spacing w:before="100" w:beforeAutospacing="1" w:after="0" w:line="240" w:lineRule="auto"/>
+        <w:ind w:left="0"/>
+        <w:rPr>
+          <w:rFonts w:eastAsia="Times New Roman" w:cstheme="minorHAnsi"/>
+          <w:color w:val="1D1C1D"/>
+          <w:kern w:val="0"/>
+          <w:sz w:val="28"/>
+          <w:szCs w:val="28"/>
+          <w:lang w:eastAsia="en-IN" w:bidi="ta-IN"/>
+          <w14:ligatures w14:val="none"/>
+        </w:rPr>
+      </w:pPr>
+      <w:r>
+        <w:rPr>
+          <w:rFonts w:eastAsia="Times New Roman" w:cstheme="minorHAnsi"/>
+          <w:color w:val="1D1C1D"/>
+          <w:kern w:val="0"/>
+          <w:sz w:val="28"/>
+          <w:szCs w:val="28"/>
+          <w:lang w:eastAsia="en-IN" w:bidi="ta-IN"/>
+          <w14:ligatures w14:val="none"/>
+        </w:rPr>
+        <w:t>Step 3: Check it in S3 bucket.</w:t>
+      </w:r>
+    </w:p>
+    <w:p>
+      <w:pPr>
+        <w:pStyle w:val="ListParagraph"/>
+        <w:shd w:val="clear" w:color="auto" w:fill="F8F8F8"/>
+        <w:spacing w:before="100" w:beforeAutospacing="1" w:after="0" w:line="240" w:lineRule="auto"/>
+        <w:ind w:left="0"/>
+        <w:rPr>
+          <w:rFonts w:eastAsia="Times New Roman" w:cstheme="minorHAnsi"/>
+          <w:color w:val="1D1C1D"/>
+          <w:kern w:val="0"/>
+          <w:sz w:val="28"/>
+          <w:szCs w:val="28"/>
+          <w:lang w:eastAsia="en-IN" w:bidi="ta-IN"/>
+          <w14:ligatures w14:val="none"/>
+        </w:rPr>
+      </w:pPr>
+      <w:r>
+        <w:rPr>
+          <w:rFonts w:eastAsia="Times New Roman" w:cstheme="minorHAnsi"/>
+          <w:color w:val="1D1C1D"/>
+          <w:kern w:val="0"/>
+          <w:sz w:val="28"/>
+          <w:szCs w:val="28"/>
+          <w:lang w:eastAsia="en-IN" w:bidi="ta-IN"/>
+          <w14:ligatures w14:val="none"/>
+        </w:rPr>
+        <w:drawing>
+          <wp:inline distT="0" distB="0" distL="0" distR="0" wp14:anchorId="033A9AEA" wp14:editId="3D12EC8E">
+            <wp:extent cx="7110730" cy="2072640"/>
+            <wp:effectExtent l="0" t="0" r="0" b="3810"/>
+            <wp:docPr id="21556526" name="Picture 1"/>
+            <wp:cNvGraphicFramePr>
+              <a:graphicFrameLocks xmlns:a="http://schemas.openxmlformats.org/drawingml/2006/main" noChangeAspect="1"/>
+            </wp:cNvGraphicFramePr>
+            <a:graphic xmlns:a="http://schemas.openxmlformats.org/drawingml/2006/main">
+              <a:graphicData uri="http://schemas.openxmlformats.org/drawingml/2006/picture">
+                <pic:pic xmlns:pic="http://schemas.openxmlformats.org/drawingml/2006/picture">
+                  <pic:nvPicPr>
+                    <pic:cNvPr id="21556526" name=""/>
+                    <pic:cNvPicPr/>
+                  </pic:nvPicPr>
+                  <pic:blipFill>
+                    <a:blip r:embed="rId43"/>
+                    <a:stretch>
+                      <a:fillRect/>
+                    </a:stretch>
+                  </pic:blipFill>
+                  <pic:spPr>
+                    <a:xfrm>
+                      <a:off x="0" y="0"/>
+                      <a:ext cx="7110730" cy="2072640"/>
+                    </a:xfrm>
+                    <a:prstGeom prst="rect">
+                      <a:avLst/>
+                    </a:prstGeom>
+                  </pic:spPr>
+                </pic:pic>
+              </a:graphicData>
+            </a:graphic>
+          </wp:inline>
+        </w:drawing>
+      </w:r>
+    </w:p>
+    <w:p>
+      <w:pPr>
+        <w:pStyle w:val="ListParagraph"/>
+        <w:shd w:val="clear" w:color="auto" w:fill="F8F8F8"/>
+        <w:spacing w:before="100" w:beforeAutospacing="1" w:after="0" w:line="240" w:lineRule="auto"/>
+        <w:ind w:left="0"/>
+        <w:rPr>
+          <w:rFonts w:eastAsia="Times New Roman" w:cstheme="minorHAnsi"/>
+          <w:color w:val="1D1C1D"/>
+          <w:kern w:val="0"/>
+          <w:sz w:val="28"/>
+          <w:szCs w:val="28"/>
+          <w:lang w:eastAsia="en-IN" w:bidi="ta-IN"/>
+          <w14:ligatures w14:val="none"/>
+        </w:rPr>
+      </w:pPr>
+    </w:p>
+    <w:p>
+      <w:pPr>
+        <w:pStyle w:val="ListParagraph"/>
+        <w:shd w:val="clear" w:color="auto" w:fill="F8F8F8"/>
+        <w:spacing w:before="100" w:beforeAutospacing="1" w:after="0" w:line="240" w:lineRule="auto"/>
+        <w:ind w:left="0"/>
+        <w:rPr>
+          <w:rFonts w:eastAsia="Times New Roman" w:cstheme="minorHAnsi"/>
+          <w:color w:val="1D1C1D"/>
+          <w:kern w:val="0"/>
+          <w:sz w:val="28"/>
+          <w:szCs w:val="28"/>
+          <w:lang w:eastAsia="en-IN" w:bidi="ta-IN"/>
+          <w14:ligatures w14:val="none"/>
+        </w:rPr>
+      </w:pPr>
+    </w:p>
+    <w:p>
+      <w:pPr>
+        <w:pStyle w:val="ListParagraph"/>
+        <w:shd w:val="clear" w:color="auto" w:fill="F8F8F8"/>
+        <w:spacing w:before="100" w:beforeAutospacing="1" w:after="0" w:line="240" w:lineRule="auto"/>
+        <w:ind w:left="0"/>
+        <w:rPr>
+          <w:rFonts w:eastAsia="Times New Roman" w:cstheme="minorHAnsi"/>
+          <w:color w:val="1D1C1D"/>
+          <w:kern w:val="0"/>
+          <w:sz w:val="28"/>
+          <w:szCs w:val="28"/>
+          <w:lang w:eastAsia="en-IN" w:bidi="ta-IN"/>
+          <w14:ligatures w14:val="none"/>
+        </w:rPr>
+      </w:pPr>
+    </w:p>
+    <w:p>
+      <w:pPr>
+        <w:pStyle w:val="ListParagraph"/>
+        <w:shd w:val="clear" w:color="auto" w:fill="F8F8F8"/>
+        <w:spacing w:before="100" w:beforeAutospacing="1" w:after="0" w:line="240" w:lineRule="auto"/>
+        <w:ind w:left="0"/>
+        <w:rPr>
+          <w:rFonts w:eastAsia="Times New Roman" w:cstheme="minorHAnsi"/>
+          <w:color w:val="1D1C1D"/>
+          <w:kern w:val="0"/>
+          <w:sz w:val="28"/>
+          <w:szCs w:val="28"/>
+          <w:lang w:eastAsia="en-IN" w:bidi="ta-IN"/>
+          <w14:ligatures w14:val="none"/>
+        </w:rPr>
+      </w:pPr>
+    </w:p>
+    <w:p>
+      <w:pPr>
+        <w:pStyle w:val="ListParagraph"/>
+        <w:shd w:val="clear" w:color="auto" w:fill="F8F8F8"/>
+        <w:spacing w:before="100" w:beforeAutospacing="1" w:after="0" w:line="240" w:lineRule="auto"/>
+        <w:ind w:left="0"/>
+        <w:rPr>
+          <w:rFonts w:eastAsia="Times New Roman" w:cstheme="minorHAnsi"/>
+          <w:color w:val="1D1C1D"/>
+          <w:kern w:val="0"/>
+          <w:sz w:val="28"/>
+          <w:szCs w:val="28"/>
+          <w:lang w:eastAsia="en-IN" w:bidi="ta-IN"/>
+          <w14:ligatures w14:val="none"/>
+        </w:rPr>
+      </w:pPr>
+    </w:p>
+    <w:p>
+      <w:pPr>
+        <w:pStyle w:val="ListParagraph"/>
+        <w:shd w:val="clear" w:color="auto" w:fill="F8F8F8"/>
+        <w:spacing w:before="100" w:beforeAutospacing="1" w:after="0" w:line="240" w:lineRule="auto"/>
+        <w:ind w:left="0"/>
+        <w:rPr>
+          <w:rFonts w:eastAsia="Times New Roman" w:cstheme="minorHAnsi"/>
+          <w:color w:val="1D1C1D"/>
+          <w:kern w:val="0"/>
+          <w:sz w:val="28"/>
+          <w:szCs w:val="28"/>
+          <w:lang w:eastAsia="en-IN" w:bidi="ta-IN"/>
+          <w14:ligatures w14:val="none"/>
+        </w:rPr>
+      </w:pPr>
+    </w:p>
+    <w:p>
+      <w:pPr>
+        <w:pStyle w:val="ListParagraph"/>
+        <w:numPr>
+          <w:ilvl w:val="0"/>
+          <w:numId w:val="1"/>
+        </w:numPr>
+        <w:shd w:val="clear" w:color="auto" w:fill="F8F8F8"/>
+        <w:tabs>
+          <w:tab w:val="clear" w:pos="720"/>
+          <w:tab w:val="num" w:pos="0"/>
+        </w:tabs>
+        <w:spacing w:before="100" w:beforeAutospacing="1" w:after="0" w:line="240" w:lineRule="auto"/>
+        <w:ind w:hanging="1004"/>
+        <w:rPr>
+          <w:rFonts w:eastAsia="Times New Roman" w:cstheme="minorHAnsi"/>
+          <w:color w:val="1D1C1D"/>
+          <w:kern w:val="0"/>
+          <w:sz w:val="36"/>
+          <w:szCs w:val="36"/>
+          <w:lang w:eastAsia="en-IN" w:bidi="ta-IN"/>
+          <w14:ligatures w14:val="none"/>
+        </w:rPr>
+      </w:pPr>
+      <w:r>
+        <w:rPr>
+          <w:rFonts w:eastAsia="Times New Roman" w:cstheme="minorHAnsi"/>
+          <w:color w:val="1D1C1D"/>
+          <w:kern w:val="0"/>
+          <w:sz w:val="36"/>
+          <w:szCs w:val="36"/>
+          <w:lang w:eastAsia="en-IN" w:bidi="ta-IN"/>
+          <w14:ligatures w14:val="none"/>
+        </w:rPr>
+        <w:lastRenderedPageBreak/>
+        <w:t>Write a Bash script to create an S3 bucket</w:t>
+      </w:r>
+      <w:r>
+        <w:rPr>
+          <w:rFonts w:eastAsia="Times New Roman" w:cstheme="minorHAnsi"/>
+          <w:color w:val="1D1C1D"/>
+          <w:kern w:val="0"/>
+          <w:sz w:val="36"/>
+          <w:szCs w:val="36"/>
+          <w:lang w:eastAsia="en-IN" w:bidi="ta-IN"/>
+          <w14:ligatures w14:val="none"/>
+        </w:rPr>
+        <w:t>.</w:t>
+      </w:r>
+    </w:p>
+    <w:p>
+      <w:pPr>
+        <w:pStyle w:val="ListParagraph"/>
+        <w:shd w:val="clear" w:color="auto" w:fill="F8F8F8"/>
+        <w:spacing w:before="100" w:beforeAutospacing="1" w:after="0" w:line="240" w:lineRule="auto"/>
+        <w:ind w:left="0"/>
+        <w:rPr>
+          <w:rFonts w:eastAsia="Times New Roman" w:cstheme="minorHAnsi"/>
+          <w:color w:val="1D1C1D"/>
+          <w:kern w:val="0"/>
+          <w:sz w:val="28"/>
+          <w:szCs w:val="28"/>
+          <w:lang w:eastAsia="en-IN" w:bidi="ta-IN"/>
+          <w14:ligatures w14:val="none"/>
+        </w:rPr>
+      </w:pPr>
+      <w:r>
+        <w:rPr>
+          <w:rFonts w:eastAsia="Times New Roman" w:cstheme="minorHAnsi"/>
+          <w:color w:val="1D1C1D"/>
+          <w:kern w:val="0"/>
+          <w:sz w:val="28"/>
+          <w:szCs w:val="28"/>
+          <w:lang w:eastAsia="en-IN" w:bidi="ta-IN"/>
+          <w14:ligatures w14:val="none"/>
+        </w:rPr>
+        <w:t>Step 1:</w:t>
+      </w:r>
+      <w:r>
+        <w:rPr>
+          <w:rFonts w:eastAsia="Times New Roman" w:cstheme="minorHAnsi"/>
+          <w:color w:val="1D1C1D"/>
+          <w:kern w:val="0"/>
+          <w:sz w:val="28"/>
+          <w:szCs w:val="28"/>
+          <w:lang w:eastAsia="en-IN" w:bidi="ta-IN"/>
+          <w14:ligatures w14:val="none"/>
+        </w:rPr>
+        <w:t xml:space="preserve"> Check whether AWS CLI is installed or not by using </w:t>
+      </w:r>
+      <w:proofErr w:type="spellStart"/>
+      <w:r>
+        <w:rPr>
+          <w:rFonts w:eastAsia="Times New Roman" w:cstheme="minorHAnsi"/>
+          <w:b/>
+          <w:bCs/>
+          <w:color w:val="1D1C1D"/>
+          <w:kern w:val="0"/>
+          <w:sz w:val="28"/>
+          <w:szCs w:val="28"/>
+          <w:lang w:eastAsia="en-IN" w:bidi="ta-IN"/>
+          <w14:ligatures w14:val="none"/>
+        </w:rPr>
+        <w:t>aws</w:t>
+      </w:r>
+      <w:proofErr w:type="spellEnd"/>
+      <w:r>
+        <w:rPr>
+          <w:rFonts w:eastAsia="Times New Roman" w:cstheme="minorHAnsi"/>
+          <w:b/>
+          <w:bCs/>
+          <w:color w:val="1D1C1D"/>
+          <w:kern w:val="0"/>
+          <w:sz w:val="28"/>
+          <w:szCs w:val="28"/>
+          <w:lang w:eastAsia="en-IN" w:bidi="ta-IN"/>
+          <w14:ligatures w14:val="none"/>
+        </w:rPr>
+        <w:t xml:space="preserve"> --version </w:t>
+      </w:r>
+      <w:r>
+        <w:rPr>
+          <w:rFonts w:eastAsia="Times New Roman" w:cstheme="minorHAnsi"/>
+          <w:color w:val="1D1C1D"/>
+          <w:kern w:val="0"/>
+          <w:sz w:val="28"/>
+          <w:szCs w:val="28"/>
+          <w:lang w:eastAsia="en-IN" w:bidi="ta-IN"/>
+          <w14:ligatures w14:val="none"/>
+        </w:rPr>
+        <w:t xml:space="preserve">if not installed, install it using </w:t>
+      </w:r>
+      <w:proofErr w:type="spellStart"/>
+      <w:r>
+        <w:rPr>
+          <w:rFonts w:eastAsia="Times New Roman" w:cstheme="minorHAnsi"/>
+          <w:b/>
+          <w:bCs/>
+          <w:color w:val="1D1C1D"/>
+          <w:kern w:val="0"/>
+          <w:sz w:val="28"/>
+          <w:szCs w:val="28"/>
+          <w:lang w:eastAsia="en-IN" w:bidi="ta-IN"/>
+          <w14:ligatures w14:val="none"/>
+        </w:rPr>
+        <w:t>sudo</w:t>
+      </w:r>
+      <w:proofErr w:type="spellEnd"/>
+      <w:r>
+        <w:rPr>
+          <w:rFonts w:eastAsia="Times New Roman" w:cstheme="minorHAnsi"/>
+          <w:b/>
+          <w:bCs/>
+          <w:color w:val="1D1C1D"/>
+          <w:kern w:val="0"/>
+          <w:sz w:val="28"/>
+          <w:szCs w:val="28"/>
+          <w:lang w:eastAsia="en-IN" w:bidi="ta-IN"/>
+          <w14:ligatures w14:val="none"/>
+        </w:rPr>
+        <w:t xml:space="preserve"> yum -y install </w:t>
+      </w:r>
+      <w:proofErr w:type="spellStart"/>
+      <w:r>
+        <w:rPr>
+          <w:rFonts w:eastAsia="Times New Roman" w:cstheme="minorHAnsi"/>
+          <w:b/>
+          <w:bCs/>
+          <w:color w:val="1D1C1D"/>
+          <w:kern w:val="0"/>
+          <w:sz w:val="28"/>
+          <w:szCs w:val="28"/>
+          <w:lang w:eastAsia="en-IN" w:bidi="ta-IN"/>
+          <w14:ligatures w14:val="none"/>
+        </w:rPr>
+        <w:t>aws</w:t>
+      </w:r>
+      <w:proofErr w:type="spellEnd"/>
+      <w:r>
+        <w:rPr>
+          <w:rFonts w:eastAsia="Times New Roman" w:cstheme="minorHAnsi"/>
+          <w:b/>
+          <w:bCs/>
+          <w:color w:val="1D1C1D"/>
+          <w:kern w:val="0"/>
+          <w:sz w:val="28"/>
+          <w:szCs w:val="28"/>
+          <w:lang w:eastAsia="en-IN" w:bidi="ta-IN"/>
+          <w14:ligatures w14:val="none"/>
+        </w:rPr>
+        <w:t>-cli.</w:t>
+      </w:r>
+    </w:p>
+    <w:p>
+      <w:pPr>
+        <w:pStyle w:val="ListParagraph"/>
+        <w:shd w:val="clear" w:color="auto" w:fill="F8F8F8"/>
+        <w:spacing w:before="100" w:beforeAutospacing="1" w:after="0" w:line="240" w:lineRule="auto"/>
+        <w:ind w:left="0"/>
+        <w:rPr>
+          <w:rFonts w:eastAsia="Times New Roman" w:cstheme="minorHAnsi"/>
+          <w:b/>
+          <w:bCs/>
+          <w:color w:val="1D1C1D"/>
+          <w:kern w:val="0"/>
+          <w:sz w:val="28"/>
+          <w:szCs w:val="28"/>
+          <w:lang w:eastAsia="en-IN" w:bidi="ta-IN"/>
+          <w14:ligatures w14:val="none"/>
+        </w:rPr>
+      </w:pPr>
+      <w:r>
+        <w:rPr>
+          <w:rFonts w:eastAsia="Times New Roman" w:cstheme="minorHAnsi"/>
+          <w:b/>
+          <w:bCs/>
+          <w:color w:val="1D1C1D"/>
+          <w:kern w:val="0"/>
+          <w:sz w:val="28"/>
+          <w:szCs w:val="28"/>
+          <w:lang w:eastAsia="en-IN" w:bidi="ta-IN"/>
+          <w14:ligatures w14:val="none"/>
+        </w:rPr>
+        <w:drawing>
+          <wp:inline distT="0" distB="0" distL="0" distR="0" wp14:anchorId="47A7F4D1" wp14:editId="61FDAD0C">
+            <wp:extent cx="7110730" cy="727075"/>
+            <wp:effectExtent l="0" t="0" r="0" b="0"/>
+            <wp:docPr id="1343386952" name="Picture 1"/>
+            <wp:cNvGraphicFramePr>
+              <a:graphicFrameLocks xmlns:a="http://schemas.openxmlformats.org/drawingml/2006/main" noChangeAspect="1"/>
+            </wp:cNvGraphicFramePr>
+            <a:graphic xmlns:a="http://schemas.openxmlformats.org/drawingml/2006/main">
+              <a:graphicData uri="http://schemas.openxmlformats.org/drawingml/2006/picture">
+                <pic:pic xmlns:pic="http://schemas.openxmlformats.org/drawingml/2006/picture">
+                  <pic:nvPicPr>
+                    <pic:cNvPr id="1343386952" name=""/>
+                    <pic:cNvPicPr/>
+                  </pic:nvPicPr>
+                  <pic:blipFill>
+                    <a:blip r:embed="rId44"/>
+                    <a:stretch>
+                      <a:fillRect/>
+                    </a:stretch>
+                  </pic:blipFill>
+                  <pic:spPr>
+                    <a:xfrm>
+                      <a:off x="0" y="0"/>
+                      <a:ext cx="7110730" cy="727075"/>
+                    </a:xfrm>
+                    <a:prstGeom prst="rect">
+                      <a:avLst/>
+                    </a:prstGeom>
+                  </pic:spPr>
+                </pic:pic>
+              </a:graphicData>
+            </a:graphic>
+          </wp:inline>
+        </w:drawing>
+      </w:r>
+    </w:p>
+    <w:p>
+      <w:pPr>
+        <w:pStyle w:val="ListParagraph"/>
+        <w:shd w:val="clear" w:color="auto" w:fill="F8F8F8"/>
+        <w:spacing w:before="100" w:beforeAutospacing="1" w:after="0" w:line="240" w:lineRule="auto"/>
+        <w:ind w:left="0"/>
+        <w:rPr>
+          <w:rFonts w:eastAsia="Times New Roman" w:cstheme="minorHAnsi"/>
+          <w:color w:val="1D1C1D"/>
+          <w:kern w:val="0"/>
+          <w:sz w:val="28"/>
+          <w:szCs w:val="28"/>
+          <w:lang w:eastAsia="en-IN" w:bidi="ta-IN"/>
+          <w14:ligatures w14:val="none"/>
+        </w:rPr>
+      </w:pPr>
+      <w:r>
+        <w:rPr>
+          <w:rFonts w:eastAsia="Times New Roman" w:cstheme="minorHAnsi"/>
+          <w:color w:val="1D1C1D"/>
+          <w:kern w:val="0"/>
+          <w:sz w:val="28"/>
+          <w:szCs w:val="28"/>
+          <w:lang w:eastAsia="en-IN" w:bidi="ta-IN"/>
+          <w14:ligatures w14:val="none"/>
+        </w:rPr>
+        <w:t>Step 2:</w:t>
+      </w:r>
+      <w:r>
+        <w:rPr>
+          <w:rFonts w:eastAsia="Times New Roman" w:cstheme="minorHAnsi"/>
+          <w:b/>
+          <w:bCs/>
+          <w:color w:val="1D1C1D"/>
+          <w:kern w:val="0"/>
+          <w:sz w:val="28"/>
+          <w:szCs w:val="28"/>
+          <w:lang w:eastAsia="en-IN" w:bidi="ta-IN"/>
+          <w14:ligatures w14:val="none"/>
+        </w:rPr>
+        <w:t xml:space="preserve"> </w:t>
+      </w:r>
+      <w:r>
+        <w:rPr>
+          <w:rFonts w:eastAsia="Times New Roman" w:cstheme="minorHAnsi"/>
+          <w:color w:val="1D1C1D"/>
+          <w:kern w:val="0"/>
+          <w:sz w:val="28"/>
+          <w:szCs w:val="28"/>
+          <w:lang w:eastAsia="en-IN" w:bidi="ta-IN"/>
+          <w14:ligatures w14:val="none"/>
+        </w:rPr>
+        <w:t xml:space="preserve">create a bash file </w:t>
+      </w:r>
+      <w:proofErr w:type="spellStart"/>
+      <w:r>
+        <w:rPr>
+          <w:rFonts w:eastAsia="Times New Roman" w:cstheme="minorHAnsi"/>
+          <w:color w:val="1D1C1D"/>
+          <w:kern w:val="0"/>
+          <w:sz w:val="28"/>
+          <w:szCs w:val="28"/>
+          <w:lang w:eastAsia="en-IN" w:bidi="ta-IN"/>
+          <w14:ligatures w14:val="none"/>
+        </w:rPr>
+        <w:t>file.bash</w:t>
+      </w:r>
+      <w:proofErr w:type="spellEnd"/>
+      <w:r>
+        <w:rPr>
+          <w:rFonts w:eastAsia="Times New Roman" w:cstheme="minorHAnsi"/>
+          <w:color w:val="1D1C1D"/>
+          <w:kern w:val="0"/>
+          <w:sz w:val="28"/>
+          <w:szCs w:val="28"/>
+          <w:lang w:eastAsia="en-IN" w:bidi="ta-IN"/>
+          <w14:ligatures w14:val="none"/>
+        </w:rPr>
+        <w:t>, give executable permission</w:t>
+      </w:r>
+      <w:r>
+        <w:rPr>
+          <w:rFonts w:eastAsia="Times New Roman" w:cstheme="minorHAnsi"/>
+          <w:color w:val="1D1C1D"/>
+          <w:kern w:val="0"/>
+          <w:sz w:val="28"/>
+          <w:szCs w:val="28"/>
+          <w:lang w:eastAsia="en-IN" w:bidi="ta-IN"/>
+          <w14:ligatures w14:val="none"/>
+        </w:rPr>
+        <w:t xml:space="preserve"> and enter the script to create S3 bucket.</w:t>
+      </w:r>
+    </w:p>
+    <w:p>
+      <w:pPr>
+        <w:pStyle w:val="ListParagraph"/>
+        <w:shd w:val="clear" w:color="auto" w:fill="F8F8F8"/>
+        <w:spacing w:before="100" w:beforeAutospacing="1" w:after="0" w:line="240" w:lineRule="auto"/>
+        <w:ind w:left="0"/>
+        <w:rPr>
+          <w:rFonts w:eastAsia="Times New Roman" w:cstheme="minorHAnsi"/>
+          <w:color w:val="1D1C1D"/>
+          <w:kern w:val="0"/>
+          <w:sz w:val="28"/>
+          <w:szCs w:val="28"/>
+          <w:lang w:eastAsia="en-IN" w:bidi="ta-IN"/>
+          <w14:ligatures w14:val="none"/>
+        </w:rPr>
+      </w:pPr>
+      <w:r>
+        <w:rPr>
+          <w:rFonts w:eastAsia="Times New Roman" w:cstheme="minorHAnsi"/>
+          <w:color w:val="1D1C1D"/>
+          <w:kern w:val="0"/>
+          <w:sz w:val="28"/>
+          <w:szCs w:val="28"/>
+          <w:lang w:eastAsia="en-IN" w:bidi="ta-IN"/>
+          <w14:ligatures w14:val="none"/>
+        </w:rPr>
+        <w:drawing>
+          <wp:inline distT="0" distB="0" distL="0" distR="0" wp14:anchorId="0831C793" wp14:editId="78C1FB76">
+            <wp:extent cx="6401693" cy="933580"/>
+            <wp:effectExtent l="0" t="0" r="0" b="0"/>
+            <wp:docPr id="2125146597" name="Picture 1"/>
+            <wp:cNvGraphicFramePr>
+              <a:graphicFrameLocks xmlns:a="http://schemas.openxmlformats.org/drawingml/2006/main" noChangeAspect="1"/>
+            </wp:cNvGraphicFramePr>
+            <a:graphic xmlns:a="http://schemas.openxmlformats.org/drawingml/2006/main">
+              <a:graphicData uri="http://schemas.openxmlformats.org/drawingml/2006/picture">
+                <pic:pic xmlns:pic="http://schemas.openxmlformats.org/drawingml/2006/picture">
+                  <pic:nvPicPr>
+                    <pic:cNvPr id="2125146597" name=""/>
+                    <pic:cNvPicPr/>
+                  </pic:nvPicPr>
+                  <pic:blipFill>
+                    <a:blip r:embed="rId45"/>
+                    <a:stretch>
+                      <a:fillRect/>
+                    </a:stretch>
+                  </pic:blipFill>
+                  <pic:spPr>
+                    <a:xfrm>
+                      <a:off x="0" y="0"/>
+                      <a:ext cx="6401693" cy="933580"/>
+                    </a:xfrm>
+                    <a:prstGeom prst="rect">
+                      <a:avLst/>
+                    </a:prstGeom>
+                  </pic:spPr>
+                </pic:pic>
+              </a:graphicData>
+            </a:graphic>
+          </wp:inline>
+        </w:drawing>
+      </w:r>
+    </w:p>
+    <w:p>
+      <w:pPr>
+        <w:pStyle w:val="ListParagraph"/>
+        <w:shd w:val="clear" w:color="auto" w:fill="F8F8F8"/>
+        <w:spacing w:before="100" w:beforeAutospacing="1" w:after="0" w:line="240" w:lineRule="auto"/>
+        <w:ind w:left="0"/>
+        <w:rPr>
+          <w:rFonts w:eastAsia="Times New Roman" w:cstheme="minorHAnsi"/>
+          <w:color w:val="1D1C1D"/>
+          <w:kern w:val="0"/>
+          <w:sz w:val="28"/>
+          <w:szCs w:val="28"/>
+          <w:lang w:eastAsia="en-IN" w:bidi="ta-IN"/>
+          <w14:ligatures w14:val="none"/>
+        </w:rPr>
+      </w:pPr>
+      <w:r>
+        <w:rPr>
+          <w:rFonts w:eastAsia="Times New Roman" w:cstheme="minorHAnsi"/>
+          <w:color w:val="1D1C1D"/>
+          <w:kern w:val="0"/>
+          <w:sz w:val="28"/>
+          <w:szCs w:val="28"/>
+          <w:lang w:eastAsia="en-IN" w:bidi="ta-IN"/>
+          <w14:ligatures w14:val="none"/>
+        </w:rPr>
+        <w:drawing>
+          <wp:inline distT="0" distB="0" distL="0" distR="0" wp14:anchorId="372C2945" wp14:editId="0E06375A">
+            <wp:extent cx="7110730" cy="3272155"/>
+            <wp:effectExtent l="0" t="0" r="0" b="4445"/>
+            <wp:docPr id="1654751825" name="Picture 1"/>
+            <wp:cNvGraphicFramePr>
+              <a:graphicFrameLocks xmlns:a="http://schemas.openxmlformats.org/drawingml/2006/main" noChangeAspect="1"/>
+            </wp:cNvGraphicFramePr>
+            <a:graphic xmlns:a="http://schemas.openxmlformats.org/drawingml/2006/main">
+              <a:graphicData uri="http://schemas.openxmlformats.org/drawingml/2006/picture">
+                <pic:pic xmlns:pic="http://schemas.openxmlformats.org/drawingml/2006/picture">
+                  <pic:nvPicPr>
+                    <pic:cNvPr id="1654751825" name=""/>
+                    <pic:cNvPicPr/>
+                  </pic:nvPicPr>
+                  <pic:blipFill>
+                    <a:blip r:embed="rId46"/>
+                    <a:stretch>
+                      <a:fillRect/>
+                    </a:stretch>
+                  </pic:blipFill>
+                  <pic:spPr>
+                    <a:xfrm>
+                      <a:off x="0" y="0"/>
+                      <a:ext cx="7110730" cy="3272155"/>
+                    </a:xfrm>
+                    <a:prstGeom prst="rect">
+                      <a:avLst/>
+                    </a:prstGeom>
+                  </pic:spPr>
+                </pic:pic>
+              </a:graphicData>
+            </a:graphic>
+          </wp:inline>
+        </w:drawing>
+      </w:r>
+    </w:p>
+    <w:p>
+      <w:pPr>
+        <w:pStyle w:val="ListParagraph"/>
+        <w:shd w:val="clear" w:color="auto" w:fill="F8F8F8"/>
+        <w:spacing w:before="100" w:beforeAutospacing="1" w:after="0" w:line="240" w:lineRule="auto"/>
+        <w:ind w:left="0"/>
+        <w:rPr>
+          <w:rFonts w:eastAsia="Times New Roman" w:cstheme="minorHAnsi"/>
+          <w:color w:val="1D1C1D"/>
+          <w:kern w:val="0"/>
+          <w:sz w:val="28"/>
+          <w:szCs w:val="28"/>
+          <w:lang w:eastAsia="en-IN" w:bidi="ta-IN"/>
+          <w14:ligatures w14:val="none"/>
+        </w:rPr>
+      </w:pPr>
+      <w:r>
+        <w:rPr>
+          <w:rFonts w:eastAsia="Times New Roman" w:cstheme="minorHAnsi"/>
+          <w:color w:val="1D1C1D"/>
+          <w:kern w:val="0"/>
+          <w:sz w:val="28"/>
+          <w:szCs w:val="28"/>
+          <w:lang w:eastAsia="en-IN" w:bidi="ta-IN"/>
+          <w14:ligatures w14:val="none"/>
+        </w:rPr>
+        <w:t>Step 3: Run the script.</w:t>
+      </w:r>
+    </w:p>
+    <w:p>
+      <w:pPr>
+        <w:pStyle w:val="ListParagraph"/>
+        <w:shd w:val="clear" w:color="auto" w:fill="F8F8F8"/>
+        <w:spacing w:before="100" w:beforeAutospacing="1" w:after="0" w:line="240" w:lineRule="auto"/>
+        <w:ind w:left="0"/>
+        <w:rPr>
+          <w:rFonts w:eastAsia="Times New Roman" w:cstheme="minorHAnsi"/>
+          <w:color w:val="1D1C1D"/>
+          <w:kern w:val="0"/>
+          <w:sz w:val="28"/>
+          <w:szCs w:val="28"/>
+          <w:lang w:eastAsia="en-IN" w:bidi="ta-IN"/>
+          <w14:ligatures w14:val="none"/>
+        </w:rPr>
+      </w:pPr>
+      <w:r>
+        <w:rPr>
+          <w:rFonts w:eastAsia="Times New Roman" w:cstheme="minorHAnsi"/>
+          <w:color w:val="1D1C1D"/>
+          <w:kern w:val="0"/>
+          <w:sz w:val="28"/>
+          <w:szCs w:val="28"/>
+          <w:lang w:eastAsia="en-IN" w:bidi="ta-IN"/>
+          <w14:ligatures w14:val="none"/>
+        </w:rPr>
+        <w:drawing>
+          <wp:inline distT="0" distB="0" distL="0" distR="0" wp14:anchorId="476D37C8" wp14:editId="26CBD7DF">
+            <wp:extent cx="7110730" cy="1428750"/>
+            <wp:effectExtent l="0" t="0" r="0" b="0"/>
+            <wp:docPr id="580189239" name="Picture 1"/>
+            <wp:cNvGraphicFramePr>
+              <a:graphicFrameLocks xmlns:a="http://schemas.openxmlformats.org/drawingml/2006/main" noChangeAspect="1"/>
+            </wp:cNvGraphicFramePr>
+            <a:graphic xmlns:a="http://schemas.openxmlformats.org/drawingml/2006/main">
+              <a:graphicData uri="http://schemas.openxmlformats.org/drawingml/2006/picture">
+                <pic:pic xmlns:pic="http://schemas.openxmlformats.org/drawingml/2006/picture">
+                  <pic:nvPicPr>
+                    <pic:cNvPr id="580189239" name=""/>
+                    <pic:cNvPicPr/>
+                  </pic:nvPicPr>
+                  <pic:blipFill>
+                    <a:blip r:embed="rId47"/>
+                    <a:stretch>
+                      <a:fillRect/>
+                    </a:stretch>
+                  </pic:blipFill>
+                  <pic:spPr>
+                    <a:xfrm>
+                      <a:off x="0" y="0"/>
+                      <a:ext cx="7110730" cy="1428750"/>
+                    </a:xfrm>
+                    <a:prstGeom prst="rect">
+                      <a:avLst/>
+                    </a:prstGeom>
+                  </pic:spPr>
+                </pic:pic>
+              </a:graphicData>
+            </a:graphic>
+          </wp:inline>
+        </w:drawing>
+      </w:r>
+      <w:r>
+        <w:rPr>
+          <w:rFonts w:eastAsia="Times New Roman" w:cstheme="minorHAnsi"/>
+          <w:color w:val="1D1C1D"/>
+          <w:kern w:val="0"/>
+          <w:sz w:val="28"/>
+          <w:szCs w:val="28"/>
+          <w:lang w:eastAsia="en-IN" w:bidi="ta-IN"/>
+          <w14:ligatures w14:val="none"/>
+        </w:rPr>
+        <w:t xml:space="preserve"> </w:t>
+      </w:r>
+    </w:p>
+    <w:p>
+      <w:pPr>
+        <w:pStyle w:val="ListParagraph"/>
+        <w:shd w:val="clear" w:color="auto" w:fill="F8F8F8"/>
+        <w:spacing w:before="100" w:beforeAutospacing="1" w:after="0" w:line="240" w:lineRule="auto"/>
+        <w:ind w:left="0"/>
+        <w:rPr>
+          <w:rFonts w:eastAsia="Times New Roman" w:cstheme="minorHAnsi"/>
+          <w:color w:val="1D1C1D"/>
+          <w:kern w:val="0"/>
+          <w:sz w:val="28"/>
+          <w:szCs w:val="28"/>
+          <w:lang w:eastAsia="en-IN" w:bidi="ta-IN"/>
+          <w14:ligatures w14:val="none"/>
+        </w:rPr>
+      </w:pPr>
+      <w:r>
+        <w:rPr>
+          <w:rFonts w:eastAsia="Times New Roman" w:cstheme="minorHAnsi"/>
+          <w:color w:val="1D1C1D"/>
+          <w:kern w:val="0"/>
+          <w:sz w:val="28"/>
+          <w:szCs w:val="28"/>
+          <w:lang w:eastAsia="en-IN" w:bidi="ta-IN"/>
+          <w14:ligatures w14:val="none"/>
+        </w:rPr>
+        <w:t xml:space="preserve">Step 4: check for created bucket using </w:t>
+      </w:r>
+      <w:proofErr w:type="spellStart"/>
+      <w:r>
+        <w:rPr>
+          <w:rFonts w:eastAsia="Times New Roman" w:cstheme="minorHAnsi"/>
+          <w:b/>
+          <w:bCs/>
+          <w:color w:val="1D1C1D"/>
+          <w:kern w:val="0"/>
+          <w:sz w:val="28"/>
+          <w:szCs w:val="28"/>
+          <w:lang w:eastAsia="en-IN" w:bidi="ta-IN"/>
+          <w14:ligatures w14:val="none"/>
+        </w:rPr>
+        <w:t>aws</w:t>
+      </w:r>
+      <w:proofErr w:type="spellEnd"/>
+      <w:r>
+        <w:rPr>
+          <w:rFonts w:eastAsia="Times New Roman" w:cstheme="minorHAnsi"/>
+          <w:b/>
+          <w:bCs/>
+          <w:color w:val="1D1C1D"/>
+          <w:kern w:val="0"/>
+          <w:sz w:val="28"/>
+          <w:szCs w:val="28"/>
+          <w:lang w:eastAsia="en-IN" w:bidi="ta-IN"/>
+          <w14:ligatures w14:val="none"/>
+        </w:rPr>
+        <w:t xml:space="preserve"> s3 ls </w:t>
+      </w:r>
+      <w:r>
+        <w:rPr>
+          <w:rFonts w:eastAsia="Times New Roman" w:cstheme="minorHAnsi"/>
+          <w:color w:val="1D1C1D"/>
+          <w:kern w:val="0"/>
+          <w:sz w:val="28"/>
+          <w:szCs w:val="28"/>
+          <w:lang w:eastAsia="en-IN" w:bidi="ta-IN"/>
+          <w14:ligatures w14:val="none"/>
+        </w:rPr>
+        <w:t>and in S3 in AWS console.</w:t>
+      </w:r>
+    </w:p>
+    <w:p>
+      <w:pPr>
+        <w:pStyle w:val="ListParagraph"/>
+        <w:shd w:val="clear" w:color="auto" w:fill="F8F8F8"/>
+        <w:spacing w:before="100" w:beforeAutospacing="1" w:after="0" w:line="240" w:lineRule="auto"/>
+        <w:ind w:left="0"/>
+        <w:rPr>
+          <w:rFonts w:eastAsia="Times New Roman" w:cstheme="minorHAnsi"/>
+          <w:color w:val="1D1C1D"/>
+          <w:kern w:val="0"/>
+          <w:sz w:val="28"/>
+          <w:szCs w:val="28"/>
+          <w:lang w:eastAsia="en-IN" w:bidi="ta-IN"/>
+          <w14:ligatures w14:val="none"/>
+        </w:rPr>
+      </w:pPr>
+      <w:r>
+        <w:rPr>
+          <w:rFonts w:eastAsia="Times New Roman" w:cstheme="minorHAnsi"/>
+          <w:color w:val="1D1C1D"/>
+          <w:kern w:val="0"/>
+          <w:sz w:val="28"/>
+          <w:szCs w:val="28"/>
+          <w:lang w:eastAsia="en-IN" w:bidi="ta-IN"/>
+          <w14:ligatures w14:val="none"/>
+        </w:rPr>
+        <w:drawing>
+          <wp:inline distT="0" distB="0" distL="0" distR="0" wp14:anchorId="2B58EBC1" wp14:editId="0D590F60">
+            <wp:extent cx="4892464" cy="1295512"/>
+            <wp:effectExtent l="0" t="0" r="3810" b="0"/>
+            <wp:docPr id="199915644" name="Picture 1"/>
+            <wp:cNvGraphicFramePr>
+              <a:graphicFrameLocks xmlns:a="http://schemas.openxmlformats.org/drawingml/2006/main" noChangeAspect="1"/>
+            </wp:cNvGraphicFramePr>
+            <a:graphic xmlns:a="http://schemas.openxmlformats.org/drawingml/2006/main">
+              <a:graphicData uri="http://schemas.openxmlformats.org/drawingml/2006/picture">
+                <pic:pic xmlns:pic="http://schemas.openxmlformats.org/drawingml/2006/picture">
+                  <pic:nvPicPr>
+                    <pic:cNvPr id="199915644" name=""/>
+                    <pic:cNvPicPr/>
+                  </pic:nvPicPr>
+                  <pic:blipFill>
+                    <a:blip r:embed="rId48"/>
+                    <a:stretch>
+                      <a:fillRect/>
+                    </a:stretch>
+                  </pic:blipFill>
+                  <pic:spPr>
+                    <a:xfrm>
+                      <a:off x="0" y="0"/>
+                      <a:ext cx="4892464" cy="1295512"/>
+                    </a:xfrm>
+                    <a:prstGeom prst="rect">
+                      <a:avLst/>
+                    </a:prstGeom>
+                  </pic:spPr>
+                </pic:pic>
+              </a:graphicData>
+            </a:graphic>
+          </wp:inline>
+        </w:drawing>
+      </w:r>
+    </w:p>
+    <w:p>
+      <w:pPr>
+        <w:pStyle w:val="ListParagraph"/>
+        <w:shd w:val="clear" w:color="auto" w:fill="F8F8F8"/>
+        <w:spacing w:before="100" w:beforeAutospacing="1" w:after="0" w:line="240" w:lineRule="auto"/>
+        <w:ind w:left="0"/>
+        <w:rPr>
+          <w:rFonts w:eastAsia="Times New Roman" w:cstheme="minorHAnsi"/>
+          <w:color w:val="1D1C1D"/>
+          <w:kern w:val="0"/>
+          <w:sz w:val="28"/>
+          <w:szCs w:val="28"/>
+          <w:lang w:eastAsia="en-IN" w:bidi="ta-IN"/>
+          <w14:ligatures w14:val="none"/>
+        </w:rPr>
+      </w:pPr>
+    </w:p>
+    <w:p>
+      <w:pPr>
+        <w:pStyle w:val="ListParagraph"/>
+        <w:shd w:val="clear" w:color="auto" w:fill="F8F8F8"/>
+        <w:spacing w:before="100" w:beforeAutospacing="1" w:after="0" w:line="240" w:lineRule="auto"/>
+        <w:ind w:left="0"/>
+        <w:rPr>
+          <w:rFonts w:eastAsia="Times New Roman" w:cstheme="minorHAnsi"/>
+          <w:color w:val="1D1C1D"/>
+          <w:kern w:val="0"/>
+          <w:sz w:val="28"/>
+          <w:szCs w:val="28"/>
+          <w:lang w:eastAsia="en-IN" w:bidi="ta-IN"/>
+          <w14:ligatures w14:val="none"/>
+        </w:rPr>
+      </w:pPr>
+      <w:r>
+        <w:rPr>
+          <w:rFonts w:eastAsia="Times New Roman" w:cstheme="minorHAnsi"/>
+          <w:color w:val="1D1C1D"/>
+          <w:kern w:val="0"/>
+          <w:sz w:val="28"/>
+          <w:szCs w:val="28"/>
+          <w:lang w:eastAsia="en-IN" w:bidi="ta-IN"/>
+          <w14:ligatures w14:val="none"/>
+        </w:rPr>
+        <w:lastRenderedPageBreak/>
+        <w:drawing>
+          <wp:inline distT="0" distB="0" distL="0" distR="0" wp14:anchorId="08040555" wp14:editId="2B38EA29">
+            <wp:extent cx="7110730" cy="2780665"/>
+            <wp:effectExtent l="0" t="0" r="0" b="635"/>
+            <wp:docPr id="1097280813" name="Picture 1"/>
+            <wp:cNvGraphicFramePr>
+              <a:graphicFrameLocks xmlns:a="http://schemas.openxmlformats.org/drawingml/2006/main" noChangeAspect="1"/>
+            </wp:cNvGraphicFramePr>
+            <a:graphic xmlns:a="http://schemas.openxmlformats.org/drawingml/2006/main">
+              <a:graphicData uri="http://schemas.openxmlformats.org/drawingml/2006/picture">
+                <pic:pic xmlns:pic="http://schemas.openxmlformats.org/drawingml/2006/picture">
+                  <pic:nvPicPr>
+                    <pic:cNvPr id="1097280813" name=""/>
+                    <pic:cNvPicPr/>
+                  </pic:nvPicPr>
+                  <pic:blipFill>
+                    <a:blip r:embed="rId49"/>
+                    <a:stretch>
+                      <a:fillRect/>
+                    </a:stretch>
+                  </pic:blipFill>
+                  <pic:spPr>
+                    <a:xfrm>
+                      <a:off x="0" y="0"/>
+                      <a:ext cx="7110730" cy="2780665"/>
+                    </a:xfrm>
+                    <a:prstGeom prst="rect">
+                      <a:avLst/>
+                    </a:prstGeom>
+                  </pic:spPr>
+                </pic:pic>
+              </a:graphicData>
+            </a:graphic>
+          </wp:inline>
+        </w:drawing>
+      </w:r>
+    </w:p>
+    <w:p>
+      <w:pPr>
+        <w:pStyle w:val="ListParagraph"/>
+        <w:shd w:val="clear" w:color="auto" w:fill="F8F8F8"/>
+        <w:spacing w:before="100" w:beforeAutospacing="1" w:after="0" w:line="240" w:lineRule="auto"/>
+        <w:ind w:left="0"/>
+        <w:rPr>
+          <w:rFonts w:eastAsia="Times New Roman" w:cstheme="minorHAnsi"/>
+          <w:color w:val="1D1C1D"/>
+          <w:kern w:val="0"/>
+          <w:sz w:val="28"/>
+          <w:szCs w:val="28"/>
+          <w:lang w:eastAsia="en-IN" w:bidi="ta-IN"/>
+          <w14:ligatures w14:val="none"/>
+        </w:rPr>
+      </w:pPr>
+    </w:p>
+    <w:p>
+      <w:pPr>
+        <w:pStyle w:val="ListParagraph"/>
+        <w:numPr>
+          <w:ilvl w:val="0"/>
+          <w:numId w:val="1"/>
+        </w:numPr>
+        <w:shd w:val="clear" w:color="auto" w:fill="FFFFFF"/>
+        <w:tabs>
+          <w:tab w:val="clear" w:pos="720"/>
+        </w:tabs>
+        <w:spacing w:before="100" w:beforeAutospacing="1" w:after="0" w:line="240" w:lineRule="auto"/>
+        <w:ind w:left="142" w:hanging="295"/>
+        <w:rPr>
+          <w:rFonts w:eastAsia="Times New Roman" w:cstheme="minorHAnsi"/>
+          <w:color w:val="1D1C1D"/>
+          <w:kern w:val="0"/>
+          <w:sz w:val="36"/>
+          <w:szCs w:val="36"/>
+          <w:lang w:eastAsia="en-IN" w:bidi="ta-IN"/>
+          <w14:ligatures w14:val="none"/>
+        </w:rPr>
+      </w:pPr>
+      <w:r>
+        <w:rPr>
+          <w:rFonts w:eastAsia="Times New Roman" w:cstheme="minorHAnsi"/>
+          <w:color w:val="1D1C1D"/>
+          <w:kern w:val="0"/>
+          <w:sz w:val="36"/>
+          <w:szCs w:val="36"/>
+          <w:lang w:eastAsia="en-IN" w:bidi="ta-IN"/>
+          <w14:ligatures w14:val="none"/>
+        </w:rPr>
+        <w:t>Upload a 1 GB file to S3 using the CLI.</w:t>
+      </w:r>
+    </w:p>
+    <w:p>
+      <w:pPr>
+        <w:pStyle w:val="ListParagraph"/>
+        <w:shd w:val="clear" w:color="auto" w:fill="FFFFFF"/>
+        <w:spacing w:before="100" w:beforeAutospacing="1" w:after="0" w:line="240" w:lineRule="auto"/>
         <w:ind w:left="142"/>
         <w:rPr>
-          <w:rFonts w:cstheme="minorHAnsi"/>
-          <w:sz w:val="28"/>
-          <w:szCs w:val="28"/>
-        </w:rPr>
-      </w:pPr>
-    </w:p>
-    <w:p/>
+          <w:rFonts w:eastAsia="Times New Roman" w:cstheme="minorHAnsi"/>
+          <w:color w:val="1D1C1D"/>
+          <w:kern w:val="0"/>
+          <w:sz w:val="28"/>
+          <w:szCs w:val="28"/>
+          <w:lang w:eastAsia="en-IN" w:bidi="ta-IN"/>
+          <w14:ligatures w14:val="none"/>
+        </w:rPr>
+      </w:pPr>
+      <w:r>
+        <w:rPr>
+          <w:rFonts w:eastAsia="Times New Roman" w:cstheme="minorHAnsi"/>
+          <w:color w:val="1D1C1D"/>
+          <w:kern w:val="0"/>
+          <w:sz w:val="28"/>
+          <w:szCs w:val="28"/>
+          <w:lang w:eastAsia="en-IN" w:bidi="ta-IN"/>
+          <w14:ligatures w14:val="none"/>
+        </w:rPr>
+        <w:t xml:space="preserve">Step 1: </w:t>
+      </w:r>
+      <w:r>
+        <w:rPr>
+          <w:rFonts w:eastAsia="Times New Roman" w:cstheme="minorHAnsi"/>
+          <w:color w:val="1D1C1D"/>
+          <w:kern w:val="0"/>
+          <w:sz w:val="28"/>
+          <w:szCs w:val="28"/>
+          <w:lang w:eastAsia="en-IN" w:bidi="ta-IN"/>
+          <w14:ligatures w14:val="none"/>
+        </w:rPr>
+        <w:t xml:space="preserve">Configure </w:t>
+      </w:r>
+      <w:proofErr w:type="spellStart"/>
+      <w:r>
+        <w:rPr>
+          <w:rFonts w:eastAsia="Times New Roman" w:cstheme="minorHAnsi"/>
+          <w:color w:val="1D1C1D"/>
+          <w:kern w:val="0"/>
+          <w:sz w:val="28"/>
+          <w:szCs w:val="28"/>
+          <w:lang w:eastAsia="en-IN" w:bidi="ta-IN"/>
+          <w14:ligatures w14:val="none"/>
+        </w:rPr>
+        <w:t>aws</w:t>
+      </w:r>
+      <w:proofErr w:type="spellEnd"/>
+      <w:r>
+        <w:rPr>
+          <w:rFonts w:eastAsia="Times New Roman" w:cstheme="minorHAnsi"/>
+          <w:color w:val="1D1C1D"/>
+          <w:kern w:val="0"/>
+          <w:sz w:val="28"/>
+          <w:szCs w:val="28"/>
+          <w:lang w:eastAsia="en-IN" w:bidi="ta-IN"/>
+          <w14:ligatures w14:val="none"/>
+        </w:rPr>
+        <w:t xml:space="preserve"> and check for s3 bucket in local machine.</w:t>
+      </w:r>
+    </w:p>
+    <w:p>
+      <w:pPr>
+        <w:rPr>
+          <w:rFonts w:cstheme="minorHAnsi"/>
+          <w:sz w:val="28"/>
+          <w:szCs w:val="28"/>
+        </w:rPr>
+      </w:pPr>
+      <w:r>
+        <w:rPr>
+          <w:rFonts w:cstheme="minorHAnsi"/>
+          <w:sz w:val="28"/>
+          <w:szCs w:val="28"/>
+        </w:rPr>
+        <w:drawing>
+          <wp:inline distT="0" distB="0" distL="0" distR="0" wp14:anchorId="612C3C8C" wp14:editId="51ED2146">
+            <wp:extent cx="7110730" cy="2152650"/>
+            <wp:effectExtent l="0" t="0" r="0" b="0"/>
+            <wp:docPr id="757243861" name="Picture 1"/>
+            <wp:cNvGraphicFramePr>
+              <a:graphicFrameLocks xmlns:a="http://schemas.openxmlformats.org/drawingml/2006/main" noChangeAspect="1"/>
+            </wp:cNvGraphicFramePr>
+            <a:graphic xmlns:a="http://schemas.openxmlformats.org/drawingml/2006/main">
+              <a:graphicData uri="http://schemas.openxmlformats.org/drawingml/2006/picture">
+                <pic:pic xmlns:pic="http://schemas.openxmlformats.org/drawingml/2006/picture">
+                  <pic:nvPicPr>
+                    <pic:cNvPr id="757243861" name=""/>
+                    <pic:cNvPicPr/>
+                  </pic:nvPicPr>
+                  <pic:blipFill>
+                    <a:blip r:embed="rId50"/>
+                    <a:stretch>
+                      <a:fillRect/>
+                    </a:stretch>
+                  </pic:blipFill>
+                  <pic:spPr>
+                    <a:xfrm>
+                      <a:off x="0" y="0"/>
+                      <a:ext cx="7110730" cy="2152650"/>
+                    </a:xfrm>
+                    <a:prstGeom prst="rect">
+                      <a:avLst/>
+                    </a:prstGeom>
+                  </pic:spPr>
+                </pic:pic>
+              </a:graphicData>
+            </a:graphic>
+          </wp:inline>
+        </w:drawing>
+      </w:r>
+    </w:p>
+    <w:p>
+      <w:pPr>
+        <w:rPr>
+          <w:rFonts w:cstheme="minorHAnsi"/>
+          <w:sz w:val="28"/>
+          <w:szCs w:val="28"/>
+        </w:rPr>
+      </w:pPr>
+      <w:r>
+        <w:rPr>
+          <w:rFonts w:cstheme="minorHAnsi"/>
+          <w:sz w:val="28"/>
+          <w:szCs w:val="28"/>
+        </w:rPr>
+        <w:t xml:space="preserve">Step 2: Use </w:t>
+      </w:r>
+      <w:proofErr w:type="spellStart"/>
+      <w:r>
+        <w:rPr>
+          <w:rFonts w:cstheme="minorHAnsi"/>
+          <w:b/>
+          <w:bCs/>
+          <w:sz w:val="28"/>
+          <w:szCs w:val="28"/>
+        </w:rPr>
+        <w:t>aws</w:t>
+      </w:r>
+      <w:proofErr w:type="spellEnd"/>
+      <w:r>
+        <w:rPr>
+          <w:rFonts w:cstheme="minorHAnsi"/>
+          <w:b/>
+          <w:bCs/>
+          <w:sz w:val="28"/>
+          <w:szCs w:val="28"/>
+        </w:rPr>
+        <w:t xml:space="preserve"> s3 cp path s3://bucket_name/object_name </w:t>
+      </w:r>
+      <w:r>
+        <w:rPr>
+          <w:rFonts w:cstheme="minorHAnsi"/>
+          <w:sz w:val="28"/>
+          <w:szCs w:val="28"/>
+        </w:rPr>
+        <w:t>to upload file.</w:t>
+      </w:r>
+    </w:p>
+    <w:p>
+      <w:r>
+        <w:drawing>
+          <wp:inline distT="0" distB="0" distL="0" distR="0" wp14:anchorId="417CE2AF" wp14:editId="6F112B8A">
+            <wp:extent cx="6830378" cy="1457528"/>
+            <wp:effectExtent l="0" t="0" r="8890" b="9525"/>
+            <wp:docPr id="532091901" name="Picture 1"/>
+            <wp:cNvGraphicFramePr>
+              <a:graphicFrameLocks xmlns:a="http://schemas.openxmlformats.org/drawingml/2006/main" noChangeAspect="1"/>
+            </wp:cNvGraphicFramePr>
+            <a:graphic xmlns:a="http://schemas.openxmlformats.org/drawingml/2006/main">
+              <a:graphicData uri="http://schemas.openxmlformats.org/drawingml/2006/picture">
+                <pic:pic xmlns:pic="http://schemas.openxmlformats.org/drawingml/2006/picture">
+                  <pic:nvPicPr>
+                    <pic:cNvPr id="532091901" name=""/>
+                    <pic:cNvPicPr/>
+                  </pic:nvPicPr>
+                  <pic:blipFill>
+                    <a:blip r:embed="rId51"/>
+                    <a:stretch>
+                      <a:fillRect/>
+                    </a:stretch>
+                  </pic:blipFill>
+                  <pic:spPr>
+                    <a:xfrm>
+                      <a:off x="0" y="0"/>
+                      <a:ext cx="6830378" cy="1457528"/>
+                    </a:xfrm>
+                    <a:prstGeom prst="rect">
+                      <a:avLst/>
+                    </a:prstGeom>
+                  </pic:spPr>
+                </pic:pic>
+              </a:graphicData>
+            </a:graphic>
+          </wp:inline>
+        </w:drawing>
+      </w:r>
+    </w:p>
+    <w:p>
+      <w:r>
+        <w:drawing>
+          <wp:inline distT="0" distB="0" distL="0" distR="0" wp14:anchorId="23644E20" wp14:editId="519B3342">
+            <wp:extent cx="6830060" cy="1171575"/>
+            <wp:effectExtent l="0" t="0" r="8890" b="9525"/>
+            <wp:docPr id="1758033889" name="Picture 1"/>
+            <wp:cNvGraphicFramePr>
+              <a:graphicFrameLocks xmlns:a="http://schemas.openxmlformats.org/drawingml/2006/main" noChangeAspect="1"/>
+            </wp:cNvGraphicFramePr>
+            <a:graphic xmlns:a="http://schemas.openxmlformats.org/drawingml/2006/main">
+              <a:graphicData uri="http://schemas.openxmlformats.org/drawingml/2006/picture">
+                <pic:pic xmlns:pic="http://schemas.openxmlformats.org/drawingml/2006/picture">
+                  <pic:nvPicPr>
+                    <pic:cNvPr id="1758033889" name=""/>
+                    <pic:cNvPicPr/>
+                  </pic:nvPicPr>
+                  <pic:blipFill>
+                    <a:blip r:embed="rId52"/>
+                    <a:stretch>
+                      <a:fillRect/>
+                    </a:stretch>
+                  </pic:blipFill>
+                  <pic:spPr>
+                    <a:xfrm>
+                      <a:off x="0" y="0"/>
+                      <a:ext cx="6831016" cy="1171739"/>
+                    </a:xfrm>
+                    <a:prstGeom prst="rect">
+                      <a:avLst/>
+                    </a:prstGeom>
+                  </pic:spPr>
+                </pic:pic>
+              </a:graphicData>
+            </a:graphic>
+          </wp:inline>
+        </w:drawing>
+      </w:r>
+    </w:p>
+    <w:p>
+      <w:pPr>
+        <w:rPr>
+          <w:sz w:val="28"/>
+          <w:szCs w:val="28"/>
+        </w:rPr>
+      </w:pPr>
+    </w:p>
+    <w:p>
+      <w:pPr>
+        <w:rPr>
+          <w:sz w:val="28"/>
+          <w:szCs w:val="28"/>
+        </w:rPr>
+      </w:pPr>
+    </w:p>
+    <w:p>
+      <w:pPr>
+        <w:rPr>
+          <w:sz w:val="28"/>
+          <w:szCs w:val="28"/>
+        </w:rPr>
+      </w:pPr>
+    </w:p>
+    <w:p>
+      <w:pPr>
+        <w:rPr>
+          <w:sz w:val="28"/>
+          <w:szCs w:val="28"/>
+        </w:rPr>
+      </w:pPr>
+    </w:p>
+    <w:p>
+      <w:pPr>
+        <w:rPr>
+          <w:sz w:val="28"/>
+          <w:szCs w:val="28"/>
+        </w:rPr>
+      </w:pPr>
+      <w:r>
+        <w:rPr>
+          <w:sz w:val="28"/>
+          <w:szCs w:val="28"/>
+        </w:rPr>
+        <w:lastRenderedPageBreak/>
+        <w:t>Step 4: Check for the file in AWS console.</w:t>
+      </w:r>
+    </w:p>
+    <w:p>
+      <w:pPr>
+        <w:rPr>
+          <w:sz w:val="28"/>
+          <w:szCs w:val="28"/>
+        </w:rPr>
+      </w:pPr>
+      <w:r>
+        <w:rPr>
+          <w:sz w:val="28"/>
+          <w:szCs w:val="28"/>
+        </w:rPr>
+        <w:drawing>
+          <wp:inline distT="0" distB="0" distL="0" distR="0" wp14:anchorId="49E844C6" wp14:editId="41F99806">
+            <wp:extent cx="7110730" cy="1693545"/>
+            <wp:effectExtent l="0" t="0" r="0" b="1905"/>
+            <wp:docPr id="1956244142" name="Picture 1"/>
+            <wp:cNvGraphicFramePr>
+              <a:graphicFrameLocks xmlns:a="http://schemas.openxmlformats.org/drawingml/2006/main" noChangeAspect="1"/>
+            </wp:cNvGraphicFramePr>
+            <a:graphic xmlns:a="http://schemas.openxmlformats.org/drawingml/2006/main">
+              <a:graphicData uri="http://schemas.openxmlformats.org/drawingml/2006/picture">
+                <pic:pic xmlns:pic="http://schemas.openxmlformats.org/drawingml/2006/picture">
+                  <pic:nvPicPr>
+                    <pic:cNvPr id="1956244142" name=""/>
+                    <pic:cNvPicPr/>
+                  </pic:nvPicPr>
+                  <pic:blipFill>
+                    <a:blip r:embed="rId53"/>
+                    <a:stretch>
+                      <a:fillRect/>
+                    </a:stretch>
+                  </pic:blipFill>
+                  <pic:spPr>
+                    <a:xfrm>
+                      <a:off x="0" y="0"/>
+                      <a:ext cx="7110730" cy="1693545"/>
+                    </a:xfrm>
+                    <a:prstGeom prst="rect">
+                      <a:avLst/>
+                    </a:prstGeom>
+                  </pic:spPr>
+                </pic:pic>
+              </a:graphicData>
+            </a:graphic>
+          </wp:inline>
+        </w:drawing>
+      </w:r>
+    </w:p>
     <w:sectPr>
       <w:pgSz w:w="11906" w:h="16838"/>
       <w:pgMar w:top="426" w:right="282" w:bottom="284" w:left="426" w:header="708" w:footer="708" w:gutter="0"/>
@@ -3075,6 +5229,119 @@
 <file path=word/numbering.xml><?xml version="1.0" encoding="utf-8"?>
 <w:numbering xmlns:wpc="http://schemas.microsoft.com/office/word/2010/wordprocessingCanvas" xmlns:cx="http://schemas.microsoft.com/office/drawing/2014/chartex" xmlns:cx1="http://schemas.microsoft.com/office/drawing/2015/9/8/chartex" xmlns:cx2="http://schemas.microsoft.com/office/drawing/2015/10/21/chartex" xmlns:cx3="http://schemas.microsoft.com/office/drawing/2016/5/9/chartex" xmlns:cx4="http://schemas.microsoft.com/office/drawing/2016/5/10/chartex" xmlns:cx5="http://schemas.microsoft.com/office/drawing/2016/5/11/chartex" xmlns:cx6="http://schemas.microsoft.com/office/drawing/2016/5/12/chartex" xmlns:cx7="http://schemas.microsoft.com/office/drawing/2016/5/13/chartex" xmlns:cx8="http://schemas.microsoft.com/office/drawing/2016/5/14/chartex" xmlns:mc="http://schemas.openxmlformats.org/markup-compatibility/2006" xmlns:aink="http://schemas.microsoft.com/office/drawing/2016/ink" xmlns:am3d="http://schemas.microsoft.com/office/drawing/2017/model3d" xmlns:o="urn:schemas-microsoft-com:office:office" xmlns:oel="http://schemas.microsoft.com/office/2019/extlst" xmlns:r="http://schemas.openxmlformats.org/officeDocument/2006/relationships" xmlns:m="http://schemas.openxmlformats.org/officeDocument/2006/math" xmlns:v="urn:schemas-microsoft-com:vml" xmlns:wp14="http://schemas.microsoft.com/office/word/2010/wordprocessingDrawing" xmlns:wp="http://schemas.openxmlformats.org/drawingml/2006/wordprocessingDrawing" xmlns:w10="urn:schemas-microsoft-com:office:word" xmlns:w="http://schemas.openxmlformats.org/wordprocessingml/2006/main" xmlns:w14="http://schemas.microsoft.com/office/word/2010/wordml" xmlns:w15="http://schemas.microsoft.com/office/word/2012/wordml" xmlns:w16cex="http://schemas.microsoft.com/office/word/2018/wordml/cex" xmlns:w16cid="http://schemas.microsoft.com/office/word/2016/wordml/cid" xmlns:w16="http://schemas.microsoft.com/office/word/2018/wordml" xmlns:w16du="http://schemas.microsoft.com/office/word/2023/wordml/word16du" xmlns:w16sdtdh="http://schemas.microsoft.com/office/word/2020/wordml/sdtdatahash" xmlns:w16sdtfl="http://schemas.microsoft.com/office/word/2024/wordml/sdtformatlock" xmlns:w16se="http://schemas.microsoft.com/office/word/2015/wordml/symex" xmlns:wpg="http://schemas.microsoft.com/office/word/2010/wordprocessingGroup" xmlns:wpi="http://schemas.microsoft.com/office/word/2010/wordprocessingInk" xmlns:wne="http://schemas.microsoft.com/office/word/2006/wordml" xmlns:wps="http://schemas.microsoft.com/office/word/2010/wordprocessingShape" mc:Ignorable="w14 w15 w16se w16cid w16 w16cex w16sdtdh w16sdtfl w16du wp14">
   <w:abstractNum w:abstractNumId="0" w15:restartNumberingAfterBreak="0">
+    <w:nsid w:val="0CE4454C"/>
+    <w:multiLevelType w:val="multilevel"/>
+    <w:tmpl w:val="7A28E436"/>
+    <w:lvl w:ilvl="0">
+      <w:start w:val="1"/>
+      <w:numFmt w:val="decimal"/>
+      <w:lvlText w:val="%1."/>
+      <w:lvlJc w:val="left"/>
+      <w:pPr>
+        <w:tabs>
+          <w:tab w:val="num" w:pos="720"/>
+        </w:tabs>
+        <w:ind w:left="720" w:hanging="360"/>
+      </w:pPr>
+    </w:lvl>
+    <w:lvl w:ilvl="1" w:tentative="1">
+      <w:start w:val="1"/>
+      <w:numFmt w:val="decimal"/>
+      <w:lvlText w:val="%2."/>
+      <w:lvlJc w:val="left"/>
+      <w:pPr>
+        <w:tabs>
+          <w:tab w:val="num" w:pos="1440"/>
+        </w:tabs>
+        <w:ind w:left="1440" w:hanging="360"/>
+      </w:pPr>
+    </w:lvl>
+    <w:lvl w:ilvl="2" w:tentative="1">
+      <w:start w:val="1"/>
+      <w:numFmt w:val="decimal"/>
+      <w:lvlText w:val="%3."/>
+      <w:lvlJc w:val="left"/>
+      <w:pPr>
+        <w:tabs>
+          <w:tab w:val="num" w:pos="2160"/>
+        </w:tabs>
+        <w:ind w:left="2160" w:hanging="360"/>
+      </w:pPr>
+    </w:lvl>
+    <w:lvl w:ilvl="3" w:tentative="1">
+      <w:start w:val="1"/>
+      <w:numFmt w:val="decimal"/>
+      <w:lvlText w:val="%4."/>
+      <w:lvlJc w:val="left"/>
+      <w:pPr>
+        <w:tabs>
+          <w:tab w:val="num" w:pos="2880"/>
+        </w:tabs>
+        <w:ind w:left="2880" w:hanging="360"/>
+      </w:pPr>
+    </w:lvl>
+    <w:lvl w:ilvl="4" w:tentative="1">
+      <w:start w:val="1"/>
+      <w:numFmt w:val="decimal"/>
+      <w:lvlText w:val="%5."/>
+      <w:lvlJc w:val="left"/>
+      <w:pPr>
+        <w:tabs>
+          <w:tab w:val="num" w:pos="3600"/>
+        </w:tabs>
+        <w:ind w:left="3600" w:hanging="360"/>
+      </w:pPr>
+    </w:lvl>
+    <w:lvl w:ilvl="5" w:tentative="1">
+      <w:start w:val="1"/>
+      <w:numFmt w:val="decimal"/>
+      <w:lvlText w:val="%6."/>
+      <w:lvlJc w:val="left"/>
+      <w:pPr>
+        <w:tabs>
+          <w:tab w:val="num" w:pos="4320"/>
+        </w:tabs>
+        <w:ind w:left="4320" w:hanging="360"/>
+      </w:pPr>
+    </w:lvl>
+    <w:lvl w:ilvl="6" w:tentative="1">
+      <w:start w:val="1"/>
+      <w:numFmt w:val="decimal"/>
+      <w:lvlText w:val="%7."/>
+      <w:lvlJc w:val="left"/>
+      <w:pPr>
+        <w:tabs>
+          <w:tab w:val="num" w:pos="5040"/>
+        </w:tabs>
+        <w:ind w:left="5040" w:hanging="360"/>
+      </w:pPr>
+    </w:lvl>
+    <w:lvl w:ilvl="7" w:tentative="1">
+      <w:start w:val="1"/>
+      <w:numFmt w:val="decimal"/>
+      <w:lvlText w:val="%8."/>
+      <w:lvlJc w:val="left"/>
+      <w:pPr>
+        <w:tabs>
+          <w:tab w:val="num" w:pos="5760"/>
+        </w:tabs>
+        <w:ind w:left="5760" w:hanging="360"/>
+      </w:pPr>
+    </w:lvl>
+    <w:lvl w:ilvl="8" w:tentative="1">
+      <w:start w:val="1"/>
+      <w:numFmt w:val="decimal"/>
+      <w:lvlText w:val="%9."/>
+      <w:lvlJc w:val="left"/>
+      <w:pPr>
+        <w:tabs>
+          <w:tab w:val="num" w:pos="6480"/>
+        </w:tabs>
+        <w:ind w:left="6480" w:hanging="360"/>
+      </w:pPr>
+    </w:lvl>
+  </w:abstractNum>
+  <w:abstractNum w:abstractNumId="1" w15:restartNumberingAfterBreak="0">
     <w:nsid w:val="1BED12DD"/>
     <w:multiLevelType w:val="multilevel"/>
     <w:tmpl w:val="9AF67A90"/>
@@ -3187,7 +5454,120 @@
       </w:pPr>
     </w:lvl>
   </w:abstractNum>
-  <w:abstractNum w:abstractNumId="1" w15:restartNumberingAfterBreak="0">
+  <w:abstractNum w:abstractNumId="2" w15:restartNumberingAfterBreak="0">
+    <w:nsid w:val="30351EBA"/>
+    <w:multiLevelType w:val="multilevel"/>
+    <w:tmpl w:val="F03E209C"/>
+    <w:lvl w:ilvl="0">
+      <w:start w:val="1"/>
+      <w:numFmt w:val="decimal"/>
+      <w:lvlText w:val="%1."/>
+      <w:lvlJc w:val="left"/>
+      <w:pPr>
+        <w:tabs>
+          <w:tab w:val="num" w:pos="720"/>
+        </w:tabs>
+        <w:ind w:left="720" w:hanging="360"/>
+      </w:pPr>
+    </w:lvl>
+    <w:lvl w:ilvl="1" w:tentative="1">
+      <w:start w:val="1"/>
+      <w:numFmt w:val="decimal"/>
+      <w:lvlText w:val="%2."/>
+      <w:lvlJc w:val="left"/>
+      <w:pPr>
+        <w:tabs>
+          <w:tab w:val="num" w:pos="1440"/>
+        </w:tabs>
+        <w:ind w:left="1440" w:hanging="360"/>
+      </w:pPr>
+    </w:lvl>
+    <w:lvl w:ilvl="2" w:tentative="1">
+      <w:start w:val="1"/>
+      <w:numFmt w:val="decimal"/>
+      <w:lvlText w:val="%3."/>
+      <w:lvlJc w:val="left"/>
+      <w:pPr>
+        <w:tabs>
+          <w:tab w:val="num" w:pos="2160"/>
+        </w:tabs>
+        <w:ind w:left="2160" w:hanging="360"/>
+      </w:pPr>
+    </w:lvl>
+    <w:lvl w:ilvl="3" w:tentative="1">
+      <w:start w:val="1"/>
+      <w:numFmt w:val="decimal"/>
+      <w:lvlText w:val="%4."/>
+      <w:lvlJc w:val="left"/>
+      <w:pPr>
+        <w:tabs>
+          <w:tab w:val="num" w:pos="2880"/>
+        </w:tabs>
+        <w:ind w:left="2880" w:hanging="360"/>
+      </w:pPr>
+    </w:lvl>
+    <w:lvl w:ilvl="4" w:tentative="1">
+      <w:start w:val="1"/>
+      <w:numFmt w:val="decimal"/>
+      <w:lvlText w:val="%5."/>
+      <w:lvlJc w:val="left"/>
+      <w:pPr>
+        <w:tabs>
+          <w:tab w:val="num" w:pos="3600"/>
+        </w:tabs>
+        <w:ind w:left="3600" w:hanging="360"/>
+      </w:pPr>
+    </w:lvl>
+    <w:lvl w:ilvl="5" w:tentative="1">
+      <w:start w:val="1"/>
+      <w:numFmt w:val="decimal"/>
+      <w:lvlText w:val="%6."/>
+      <w:lvlJc w:val="left"/>
+      <w:pPr>
+        <w:tabs>
+          <w:tab w:val="num" w:pos="4320"/>
+        </w:tabs>
+        <w:ind w:left="4320" w:hanging="360"/>
+      </w:pPr>
+    </w:lvl>
+    <w:lvl w:ilvl="6" w:tentative="1">
+      <w:start w:val="1"/>
+      <w:numFmt w:val="decimal"/>
+      <w:lvlText w:val="%7."/>
+      <w:lvlJc w:val="left"/>
+      <w:pPr>
+        <w:tabs>
+          <w:tab w:val="num" w:pos="5040"/>
+        </w:tabs>
+        <w:ind w:left="5040" w:hanging="360"/>
+      </w:pPr>
+    </w:lvl>
+    <w:lvl w:ilvl="7" w:tentative="1">
+      <w:start w:val="1"/>
+      <w:numFmt w:val="decimal"/>
+      <w:lvlText w:val="%8."/>
+      <w:lvlJc w:val="left"/>
+      <w:pPr>
+        <w:tabs>
+          <w:tab w:val="num" w:pos="5760"/>
+        </w:tabs>
+        <w:ind w:left="5760" w:hanging="360"/>
+      </w:pPr>
+    </w:lvl>
+    <w:lvl w:ilvl="8" w:tentative="1">
+      <w:start w:val="1"/>
+      <w:numFmt w:val="decimal"/>
+      <w:lvlText w:val="%9."/>
+      <w:lvlJc w:val="left"/>
+      <w:pPr>
+        <w:tabs>
+          <w:tab w:val="num" w:pos="6480"/>
+        </w:tabs>
+        <w:ind w:left="6480" w:hanging="360"/>
+      </w:pPr>
+    </w:lvl>
+  </w:abstractNum>
+  <w:abstractNum w:abstractNumId="3" w15:restartNumberingAfterBreak="0">
     <w:nsid w:val="5252514D"/>
     <w:multiLevelType w:val="multilevel"/>
     <w:tmpl w:val="5D7E347C"/>
@@ -3300,7 +5680,7 @@
       </w:pPr>
     </w:lvl>
   </w:abstractNum>
-  <w:abstractNum w:abstractNumId="2" w15:restartNumberingAfterBreak="0">
+  <w:abstractNum w:abstractNumId="4" w15:restartNumberingAfterBreak="0">
     <w:nsid w:val="55FD0FFA"/>
     <w:multiLevelType w:val="multilevel"/>
     <w:tmpl w:val="F09AEA5A"/>
@@ -3418,7 +5798,7 @@
       </w:pPr>
     </w:lvl>
   </w:abstractNum>
-  <w:abstractNum w:abstractNumId="3" w15:restartNumberingAfterBreak="0">
+  <w:abstractNum w:abstractNumId="5" w15:restartNumberingAfterBreak="0">
     <w:nsid w:val="59CE0679"/>
     <w:multiLevelType w:val="multilevel"/>
     <w:tmpl w:val="DE6ED0B8"/>
@@ -3531,17 +5911,139 @@
       </w:pPr>
     </w:lvl>
   </w:abstractNum>
+  <w:abstractNum w:abstractNumId="6" w15:restartNumberingAfterBreak="0">
+    <w:nsid w:val="7AA26AC7"/>
+    <w:multiLevelType w:val="multilevel"/>
+    <w:tmpl w:val="26120852"/>
+    <w:lvl w:ilvl="0">
+      <w:start w:val="1"/>
+      <w:numFmt w:val="decimal"/>
+      <w:lvlText w:val="%1."/>
+      <w:lvlJc w:val="left"/>
+      <w:pPr>
+        <w:tabs>
+          <w:tab w:val="num" w:pos="720"/>
+        </w:tabs>
+        <w:ind w:left="720" w:hanging="360"/>
+      </w:pPr>
+    </w:lvl>
+    <w:lvl w:ilvl="1" w:tentative="1">
+      <w:start w:val="1"/>
+      <w:numFmt w:val="decimal"/>
+      <w:lvlText w:val="%2."/>
+      <w:lvlJc w:val="left"/>
+      <w:pPr>
+        <w:tabs>
+          <w:tab w:val="num" w:pos="1440"/>
+        </w:tabs>
+        <w:ind w:left="1440" w:hanging="360"/>
+      </w:pPr>
+    </w:lvl>
+    <w:lvl w:ilvl="2" w:tentative="1">
+      <w:start w:val="1"/>
+      <w:numFmt w:val="decimal"/>
+      <w:lvlText w:val="%3."/>
+      <w:lvlJc w:val="left"/>
+      <w:pPr>
+        <w:tabs>
+          <w:tab w:val="num" w:pos="2160"/>
+        </w:tabs>
+        <w:ind w:left="2160" w:hanging="360"/>
+      </w:pPr>
+    </w:lvl>
+    <w:lvl w:ilvl="3" w:tentative="1">
+      <w:start w:val="1"/>
+      <w:numFmt w:val="decimal"/>
+      <w:lvlText w:val="%4."/>
+      <w:lvlJc w:val="left"/>
+      <w:pPr>
+        <w:tabs>
+          <w:tab w:val="num" w:pos="2880"/>
+        </w:tabs>
+        <w:ind w:left="2880" w:hanging="360"/>
+      </w:pPr>
+    </w:lvl>
+    <w:lvl w:ilvl="4" w:tentative="1">
+      <w:start w:val="1"/>
+      <w:numFmt w:val="decimal"/>
+      <w:lvlText w:val="%5."/>
+      <w:lvlJc w:val="left"/>
+      <w:pPr>
+        <w:tabs>
+          <w:tab w:val="num" w:pos="3600"/>
+        </w:tabs>
+        <w:ind w:left="3600" w:hanging="360"/>
+      </w:pPr>
+    </w:lvl>
+    <w:lvl w:ilvl="5" w:tentative="1">
+      <w:start w:val="1"/>
+      <w:numFmt w:val="decimal"/>
+      <w:lvlText w:val="%6."/>
+      <w:lvlJc w:val="left"/>
+      <w:pPr>
+        <w:tabs>
+          <w:tab w:val="num" w:pos="4320"/>
+        </w:tabs>
+        <w:ind w:left="4320" w:hanging="360"/>
+      </w:pPr>
+    </w:lvl>
+    <w:lvl w:ilvl="6" w:tentative="1">
+      <w:start w:val="1"/>
+      <w:numFmt w:val="decimal"/>
+      <w:lvlText w:val="%7."/>
+      <w:lvlJc w:val="left"/>
+      <w:pPr>
+        <w:tabs>
+          <w:tab w:val="num" w:pos="5040"/>
+        </w:tabs>
+        <w:ind w:left="5040" w:hanging="360"/>
+      </w:pPr>
+    </w:lvl>
+    <w:lvl w:ilvl="7" w:tentative="1">
+      <w:start w:val="1"/>
+      <w:numFmt w:val="decimal"/>
+      <w:lvlText w:val="%8."/>
+      <w:lvlJc w:val="left"/>
+      <w:pPr>
+        <w:tabs>
+          <w:tab w:val="num" w:pos="5760"/>
+        </w:tabs>
+        <w:ind w:left="5760" w:hanging="360"/>
+      </w:pPr>
+    </w:lvl>
+    <w:lvl w:ilvl="8" w:tentative="1">
+      <w:start w:val="1"/>
+      <w:numFmt w:val="decimal"/>
+      <w:lvlText w:val="%9."/>
+      <w:lvlJc w:val="left"/>
+      <w:pPr>
+        <w:tabs>
+          <w:tab w:val="num" w:pos="6480"/>
+        </w:tabs>
+        <w:ind w:left="6480" w:hanging="360"/>
+      </w:pPr>
+    </w:lvl>
+  </w:abstractNum>
   <w:num w:numId="1" w16cid:durableId="1201176">
-    <w:abstractNumId w:val="2"/>
+    <w:abstractNumId w:val="4"/>
   </w:num>
   <w:num w:numId="2" w16cid:durableId="1863975326">
+    <w:abstractNumId w:val="3"/>
+  </w:num>
+  <w:num w:numId="3" w16cid:durableId="1006637225">
     <w:abstractNumId w:val="1"/>
   </w:num>
-  <w:num w:numId="3" w16cid:durableId="1006637225">
+  <w:num w:numId="4" w16cid:durableId="1310281706">
+    <w:abstractNumId w:val="5"/>
+  </w:num>
+  <w:num w:numId="5" w16cid:durableId="1077744319">
     <w:abstractNumId w:val="0"/>
   </w:num>
-  <w:num w:numId="4" w16cid:durableId="1310281706">
-    <w:abstractNumId w:val="3"/>
+  <w:num w:numId="6" w16cid:durableId="1100878878">
+    <w:abstractNumId w:val="6"/>
+  </w:num>
+  <w:num w:numId="7" w16cid:durableId="1106802844">
+    <w:abstractNumId w:val="2"/>
   </w:num>
 </w:numbering>
 </file>

</xml_diff>